<commit_message>
fix(lab4): resolve XML entity escaping in Word report
</commit_message>
<xml_diff>
--- a/Lab_4/lab_04.docx
+++ b/Lab_4/lab_04.docx
@@ -1,28 +1,1284 @@
 
-<file path=word/document.xml><?xml version="1.0" encoding="UTF-8" standalone="yes"?>
-<w:document xmlns:wpc="http://schemas.microsoft.com/office/word/2010/wordprocessingCanvas" xmlns:cx="http://schemas.microsoft.com/office/drawing/2014/chartex" xmlns:cx1="http://schemas.microsoft.com/office/drawing/2015/9/8/chartex" xmlns:cx2="http://schemas.microsoft.com/office/drawing/2015/10/21/chartex" xmlns:cx3="http://schemas.microsoft.com/office/drawing/2016/5/9/chartex" xmlns:cx4="http://schemas.microsoft.com/office/drawing/2016/5/10/chartex" xmlns:cx5="http://schemas.microsoft.com/office/drawing/2016/5/11/chartex" xmlns:cx6="http://schemas.microsoft.com/office/drawing/2016/5/12/chartex" xmlns:cx7="http://schemas.microsoft.com/office/drawing/2016/5/13/chartex" xmlns:cx8="http://schemas.microsoft.com/office/drawing/2016/5/14/chartex" xmlns:mc="http://schemas.openxmlformats.org/markup-compatibility/2006" xmlns:aink="http://schemas.microsoft.com/office/drawing/2016/ink" xmlns:am3d="http://schemas.microsoft.com/office/drawing/2017/model3d" xmlns:o="urn:schemas-microsoft-com:office:office" xmlns:oel="http://schemas.microsoft.com/office/2019/extlst" xmlns:r="http://schemas.openxmlformats.org/officeDocument/2006/relationships" xmlns:m="http://schemas.openxmlformats.org/officeDocument/2006/math" xmlns:v="urn:schemas-microsoft-com:vml" xmlns:wp14="http://schemas.microsoft.com/office/word/2010/wordprocessingDrawing" xmlns:wp="http://schemas.openxmlformats.org/drawingml/2006/wordprocessingDrawing" xmlns:w10="urn:schemas-microsoft-com:office:word" xmlns:w="http://schemas.openxmlformats.org/wordprocessingml/2006/main" xmlns:w14="http://schemas.microsoft.com/office/word/2010/wordml" xmlns:w15="http://schemas.microsoft.com/office/word/2012/wordml" xmlns:w16cex="http://schemas.microsoft.com/office/word/2018/wordml/cex" xmlns:w16cid="http://schemas.microsoft.com/office/word/2016/wordml/cid" xmlns:w16="http://schemas.microsoft.com/office/word/2018/wordml" xmlns:w16sdtdh="http://schemas.microsoft.com/office/word/2020/wordml/sdtdatahash" xmlns:w16se="http://schemas.microsoft.com/office/word/2015/wordml/symex" xmlns:wpg="http://schemas.microsoft.com/office/word/2010/wordprocessingGroup" xmlns:wpi="http://schemas.microsoft.com/office/word/2010/wordprocessingInk" xmlns:wne="http://schemas.microsoft.com/office/word/2006/wordml" xmlns:wps="http://schemas.microsoft.com/office/word/2010/wordprocessingShape" mc:Ignorable="w14 w15 w16se w16cid w16 w16cex w16sdtdh wp14"><w:body><w:p><w:pPr><w:spacing w:before="40" w:after="40" w:line="360" w:lineRule="exact"/><w:jc w:val="center"/><w:rPr><w:b/></w:rPr></w:pPr><w:r><w:rPr><w:b/><w:noProof/></w:rPr><w:drawing><wp:anchor distT="0" distB="0" distL="114300" distR="114300" simplePos="0" relativeHeight="251660288" behindDoc="1" locked="0" layoutInCell="1" allowOverlap="1" wp14:anchorId="74DB7995" wp14:editId="22D450C0"><wp:simplePos x="0" y="0"/><wp:positionH relativeFrom="column"><wp:posOffset>100330</wp:posOffset></wp:positionH><wp:positionV relativeFrom="paragraph"><wp:posOffset>-137795</wp:posOffset></wp:positionV><wp:extent cx="1774190" cy="705485"/><wp:effectExtent l="0" t="0" r="0" b="0"/><wp:wrapNone/><wp:docPr id="98" name="Picture 98" descr="Logo"/><wp:cNvGraphicFramePr><a:graphicFrameLocks xmlns:a="http://schemas.openxmlformats.org/drawingml/2006/main" noChangeAspect="1"/></wp:cNvGraphicFramePr><a:graphic xmlns:a="http://schemas.openxmlformats.org/drawingml/2006/main"><a:graphicData uri="http://schemas.openxmlformats.org/drawingml/2006/picture"><pic:pic xmlns:pic="http://schemas.openxmlformats.org/drawingml/2006/picture"><pic:nvPicPr><pic:cNvPr id="98" name="Picture 98" descr="Logo"/><pic:cNvPicPr><a:picLocks noChangeAspect="1" noChangeArrowheads="1"/></pic:cNvPicPr></pic:nvPicPr><pic:blipFill><a:blip r:embed="rId8"><a:extLst><a:ext uri="{28A0092B-C50C-407E-A947-70E740481C1C}"><a14:useLocalDpi xmlns:a14="http://schemas.microsoft.com/office/drawing/2010/main" val="0"/></a:ext></a:extLst></a:blip><a:srcRect/><a:stretch><a:fillRect/></a:stretch></pic:blipFill><pic:spPr><a:xfrm><a:off x="0" y="0"/><a:ext cx="1774190" cy="705485"/></a:xfrm><a:prstGeom prst="rect"><a:avLst/></a:prstGeom><a:noFill/><a:ln><a:noFill/></a:ln></pic:spPr></pic:pic></a:graphicData></a:graphic></wp:anchor></w:drawing></w:r></w:p><w:p><w:pPr><w:spacing w:before="40" w:after="40" w:line="360" w:lineRule="exact"/><w:jc w:val="center"/><w:rPr><w:b/><w:sz w:val="36"/><w:szCs w:val="36"/></w:rPr></w:pPr><w:r><w:rPr><w:b/><w:sz w:val="36"/><w:szCs w:val="36"/></w:rPr><w:t>BỘ CÔNG THƯƠNG</w:t></w:r></w:p><w:p><w:pPr><w:spacing w:before="40" w:after="40" w:line="360" w:lineRule="exact"/><w:jc w:val="center"/><w:rPr><w:sz w:val="30"/><w:szCs w:val="30"/></w:rPr></w:pPr><w:r><w:rPr><w:b/><w:sz w:val="30"/><w:szCs w:val="30"/></w:rPr><w:t xml:space="preserve">TRƯỜNG ĐẠI HỌC CÔNG NGHIỆP TP HỒ CHÍ MINH </w:t></w:r></w:p><w:p><w:pPr><w:spacing w:before="40" w:after="40" w:line="360" w:lineRule="exact"/><w:jc w:val="center"/></w:pPr><w:r><w:t>----------------------</w:t></w:r></w:p><w:p><w:pPr><w:spacing w:before="40" w:after="40" w:line="360" w:lineRule="exact"/><w:jc w:val="center"/><w:rPr><w:b/><w:sz w:val="28"/></w:rPr></w:pPr><w:r><w:rPr><w:b/><w:sz w:val="28"/></w:rPr><w:t>Khoa: Công Nghệ Thông Tin</w:t></w:r></w:p><w:p><w:pPr><w:widowControl w:val="0"/><w:autoSpaceDE w:val="0"/><w:autoSpaceDN w:val="0"/><w:adjustRightInd w:val="0"/><w:ind w:left="120" w:right="-20"/><w:rPr><w:sz w:val="26"/><w:szCs w:val="26"/></w:rPr></w:pPr></w:p><w:p><w:pPr><w:widowControl w:val="0"/><w:autoSpaceDE w:val="0"/><w:autoSpaceDN w:val="0"/><w:adjustRightInd w:val="0"/><w:ind w:left="120" w:right="-20"/><w:rPr><w:sz w:val="26"/><w:szCs w:val="26"/></w:rPr></w:pPr></w:p><w:p><w:pPr><w:widowControl w:val="0"/><w:autoSpaceDE w:val="0"/><w:autoSpaceDN w:val="0"/><w:adjustRightInd w:val="0"/><w:ind w:left="120" w:right="-20"/><w:rPr><w:sz w:val="26"/><w:szCs w:val="26"/></w:rPr></w:pPr><w:r><w:rPr><w:noProof/><w:sz w:val="26"/><w:szCs w:val="26"/></w:rPr><mc:AlternateContent><mc:Choice Requires="wps"><w:drawing><wp:anchor distT="0" distB="0" distL="114300" distR="114300" simplePos="0" relativeHeight="251661312" behindDoc="0" locked="0" layoutInCell="1" allowOverlap="1" wp14:anchorId="462AA6E6" wp14:editId="6D519487"><wp:simplePos x="0" y="0"/><wp:positionH relativeFrom="column"><wp:posOffset>1481455</wp:posOffset></wp:positionH><wp:positionV relativeFrom="paragraph"><wp:posOffset>76200</wp:posOffset></wp:positionV><wp:extent cx="3279140" cy="1616075"/><wp:effectExtent l="0" t="0" r="16510" b="22860"/><wp:wrapNone/><wp:docPr id="4" name="Rounded Rectangle 4"/><wp:cNvGraphicFramePr/><a:graphic xmlns:a="http://schemas.openxmlformats.org/drawingml/2006/main"><a:graphicData uri="http://schemas.microsoft.com/office/word/2010/wordprocessingShape"><wps:wsp><wps:cNvSpPr/><wps:spPr><a:xfrm><a:off x="0" y="0"/><a:ext cx="3279227" cy="1615965"/></a:xfrm><a:prstGeom prst="roundRect"><a:avLst/></a:prstGeom><a:blipFill dpi="0" rotWithShape="1"><a:blip r:embed="rId9"><a:extLst><a:ext uri="{28A0092B-C50C-407E-A947-70E740481C1C}"><a14:useLocalDpi xmlns:a14="http://schemas.microsoft.com/office/drawing/2010/main" val="0"/></a:ext></a:extLst></a:blip><a:srcRect/><a:stretch><a:fillRect/></a:stretch></a:blipFill></wps:spPr><wps:style><a:lnRef idx="2"><a:schemeClr val="accent1"><a:shade val="50000"/></a:schemeClr></a:lnRef><a:fillRef idx="1"><a:schemeClr val="accent1"/></a:fillRef><a:effectRef idx="0"><a:schemeClr val="accent1"/></a:effectRef><a:fontRef idx="minor"><a:schemeClr val="lt1"/></a:fontRef></wps:style><wps:bodyPr rot="0" spcFirstLastPara="0" vertOverflow="overflow" horzOverflow="overflow" vert="horz" wrap="square" lIns="91440" tIns="45720" rIns="91440" bIns="45720" numCol="1" spcCol="0" rtlCol="0" fromWordArt="0" anchor="ctr" anchorCtr="0" forceAA="0" compatLnSpc="1"><a:noAutofit/></wps:bodyPr></wps:wsp></a:graphicData></a:graphic></wp:anchor></w:drawing></mc:Choice><mc:Fallback xmlns:wpsCustomData="http://www.wps.cn/officeDocument/2013/wpsCustomData"><w:pict><v:roundrect id="_x0000_s1026" o:spid="_x0000_s1026" o:spt="2" style="position:absolute;left:0pt;margin-left:116.65pt;margin-top:6pt;height:127.25pt;width:258.2pt;z-index:251661312;v-text-anchor:middle;mso-width-relative:page;mso-height-relative:page;" filled="t" stroked="t" coordsize="21600,21600" arcsize="0.166666666666667" o:gfxdata="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"><v:fill type="frame" on="t" focussize="0,0" recolor="t" rotate="t" r:id="rId10"/><v:stroke weight="1pt" color="#2F528F [3204]" miterlimit="8" joinstyle="miter"/><v:imagedata o:title=""/><o:lock v:ext="edit" aspectratio="f"/></v:roundrect></w:pict></mc:Fallback></mc:AlternateContent></w:r></w:p><w:p><w:pPr><w:widowControl w:val="0"/><w:autoSpaceDE w:val="0"/><w:autoSpaceDN w:val="0"/><w:adjustRightInd w:val="0"/><w:ind w:left="120" w:right="-20"/><w:rPr><w:sz w:val="26"/><w:szCs w:val="26"/></w:rPr></w:pPr></w:p><w:p><w:pPr><w:widowControl w:val="0"/><w:autoSpaceDE w:val="0"/><w:autoSpaceDN w:val="0"/><w:adjustRightInd w:val="0"/><w:ind w:left="120" w:right="-20"/><w:rPr><w:sz w:val="26"/><w:szCs w:val="26"/></w:rPr></w:pPr></w:p><w:p><w:pPr><w:widowControl w:val="0"/><w:autoSpaceDE w:val="0"/><w:autoSpaceDN w:val="0"/><w:adjustRightInd w:val="0"/><w:ind w:left="120" w:right="-20"/><w:rPr><w:sz w:val="26"/><w:szCs w:val="26"/></w:rPr></w:pPr></w:p><w:p><w:pPr><w:widowControl w:val="0"/><w:autoSpaceDE w:val="0"/><w:autoSpaceDN w:val="0"/><w:adjustRightInd w:val="0"/><w:ind w:left="120" w:right="-20"/><w:rPr><w:sz w:val="26"/><w:szCs w:val="26"/></w:rPr></w:pPr></w:p><w:p><w:pPr><w:widowControl w:val="0"/><w:autoSpaceDE w:val="0"/><w:autoSpaceDN w:val="0"/><w:adjustRightInd w:val="0"/><w:ind w:left="120" w:right="-20"/><w:rPr><w:sz w:val="26"/><w:szCs w:val="26"/></w:rPr></w:pPr></w:p><w:p><w:pPr><w:widowControl w:val="0"/><w:autoSpaceDE w:val="0"/><w:autoSpaceDN w:val="0"/><w:adjustRightInd w:val="0"/><w:ind w:left="120" w:right="-20"/><w:rPr><w:sz w:val="26"/><w:szCs w:val="26"/></w:rPr></w:pPr></w:p><w:p><w:pPr><w:widowControl w:val="0"/><w:autoSpaceDE w:val="0"/><w:autoSpaceDN w:val="0"/><w:adjustRightInd w:val="0"/><w:ind w:left="120" w:right="-20"/><w:rPr><w:sz w:val="26"/><w:szCs w:val="26"/></w:rPr></w:pPr></w:p><w:p><w:pPr><w:widowControl w:val="0"/><w:autoSpaceDE w:val="0"/><w:autoSpaceDN w:val="0"/><w:adjustRightInd w:val="0"/><w:ind w:left="120" w:right="-20"/><w:rPr><w:sz w:val="26"/><w:szCs w:val="26"/></w:rPr></w:pPr></w:p><w:p><w:pPr><w:widowControl w:val="0"/><w:autoSpaceDE w:val="0"/><w:autoSpaceDN w:val="0"/><w:adjustRightInd w:val="0"/><w:ind w:left="120" w:right="-20"/><w:rPr><w:sz w:val="26"/><w:szCs w:val="26"/></w:rPr></w:pPr></w:p><w:p><w:pPr><w:widowControl w:val="0"/><w:autoSpaceDE w:val="0"/><w:autoSpaceDN w:val="0"/><w:adjustRightInd w:val="0"/><w:ind w:left="120" w:right="-20"/><w:rPr><w:sz w:val="26"/><w:szCs w:val="26"/></w:rPr></w:pPr></w:p><w:p><w:pPr><w:widowControl w:val="0"/><w:autoSpaceDE w:val="0"/><w:autoSpaceDN w:val="0"/><w:adjustRightInd w:val="0"/><w:ind w:left="120" w:right="-20"/><w:rPr><w:sz w:val="26"/><w:szCs w:val="26"/></w:rPr></w:pPr></w:p><w:p><w:pPr><w:widowControl w:val="0"/><w:autoSpaceDE w:val="0"/><w:autoSpaceDN w:val="0"/><w:adjustRightInd w:val="0"/><w:ind w:left="120" w:right="-20"/><w:rPr><w:sz w:val="26"/><w:szCs w:val="26"/></w:rPr></w:pPr></w:p><w:p><w:pPr><w:widowControl w:val="0"/><w:autoSpaceDE w:val="0"/><w:autoSpaceDN w:val="0"/><w:adjustRightInd w:val="0"/><w:ind w:left="120" w:right="-20"/><w:rPr><w:sz w:val="26"/><w:szCs w:val="26"/></w:rPr></w:pPr></w:p><w:p><w:pPr><w:widowControl w:val="0"/><w:autoSpaceDE w:val="0"/><w:autoSpaceDN w:val="0"/><w:adjustRightInd w:val="0"/><w:ind w:left="120" w:right="-20"/><w:rPr><w:sz w:val="26"/><w:szCs w:val="26"/></w:rPr></w:pPr></w:p><w:p><w:pPr><w:widowControl w:val="0"/><w:autoSpaceDE w:val="0"/><w:autoSpaceDN w:val="0"/><w:adjustRightInd w:val="0"/><w:ind w:left="120" w:right="-20"/><w:rPr><w:sz w:val="26"/><w:szCs w:val="26"/></w:rPr></w:pPr></w:p><w:p><w:pPr><w:ind w:firstLine="360"/><w:rPr><w:sz w:val="44"/><w:szCs w:val="44"/></w:rPr></w:pPr><w:r><w:rPr><w:sz w:val="44"/><w:szCs w:val="44"/></w:rPr><w:t>Student’s Name</w:t></w:r><w:proofErr w:type="gramStart"/><w:r><w:rPr><w:sz w:val="44"/><w:szCs w:val="44"/></w:rPr><w:tab/><w:t>:Nguyễn</w:t></w:r><w:proofErr w:type="gramEnd"/><w:r><w:rPr><w:sz w:val="44"/><w:szCs w:val="44"/></w:rPr><w:t xml:space="preserve"> Văn Cal</w:t></w:r></w:p><w:p><w:pPr><w:tabs><w:tab w:val="left" w:pos="2160"/></w:tabs><w:ind w:firstLine="360"/><w:rPr><w:sz w:val="44"/><w:szCs w:val="44"/></w:rPr></w:pPr><w:r><w:rPr><w:sz w:val="44"/><w:szCs w:val="44"/></w:rPr><w:t>Class Code</w:t></w:r><w:r><w:rPr><w:sz w:val="44"/><w:szCs w:val="44"/></w:rPr><w:tab/></w:r><w:r><w:rPr><w:sz w:val="44"/><w:szCs w:val="44"/></w:rPr><w:tab/><w:t>:</w:t></w:r></w:p><w:p><w:pPr><w:tabs><w:tab w:val="left" w:pos="2160"/></w:tabs><w:ind w:firstLine="360"/><w:rPr><w:sz w:val="36"/><w:szCs w:val="36"/></w:rPr></w:pPr><w:r><w:rPr><w:sz w:val="44"/><w:szCs w:val="44"/></w:rPr><w:t>Subject</w:t></w:r><w:r><w:rPr><w:sz w:val="44"/><w:szCs w:val="44"/></w:rPr><w:tab/></w:r><w:r><w:rPr><w:sz w:val="44"/><w:szCs w:val="44"/></w:rPr><w:tab/></w:r><w:r><w:rPr><w:sz w:val="44"/><w:szCs w:val="44"/></w:rPr><w:tab/><w:t>:</w:t></w:r></w:p><w:p><w:pPr><w:tabs><w:tab w:val="left" w:pos="2160"/></w:tabs><w:ind w:firstLine="360"/><w:rPr><w:sz w:val="44"/><w:szCs w:val="44"/></w:rPr></w:pPr><w:r><w:rPr><w:sz w:val="44"/><w:szCs w:val="44"/></w:rPr><w:t>Instructor</w:t></w:r><w:r><w:rPr><w:sz w:val="44"/><w:szCs w:val="44"/></w:rPr><w:tab/></w:r><w:r><w:rPr><w:sz w:val="44"/><w:szCs w:val="44"/></w:rPr><w:tab/></w:r><w:r><w:rPr><w:sz w:val="44"/><w:szCs w:val="44"/></w:rPr><w:tab/><w:t>:</w:t></w:r></w:p><w:p><w:pPr><w:ind w:firstLine="360"/><w:rPr><w:sz w:val="44"/><w:szCs w:val="44"/></w:rPr></w:pPr><w:r><w:rPr><w:sz w:val="44"/><w:szCs w:val="44"/></w:rPr><w:t>Faculty</w:t></w:r><w:r><w:rPr><w:sz w:val="44"/><w:szCs w:val="44"/></w:rPr><w:tab/></w:r><w:r><w:rPr><w:sz w:val="44"/><w:szCs w:val="44"/></w:rPr><w:tab/></w:r><w:r><w:rPr><w:sz w:val="44"/><w:szCs w:val="44"/></w:rPr><w:tab/><w:t>:</w:t></w:r></w:p><w:p><w:pPr><w:ind w:firstLine="360"/><w:rPr><w:sz w:val="44"/><w:szCs w:val="44"/></w:rPr></w:pPr><w:r><w:rPr><w:sz w:val="44"/><w:szCs w:val="44"/></w:rPr><w:t>Completed Date</w:t></w:r><w:r><w:rPr><w:sz w:val="44"/><w:szCs w:val="44"/></w:rPr><w:tab/><w:t>:</w:t></w:r></w:p><w:p><w:pPr><w:widowControl w:val="0"/><w:autoSpaceDE w:val="0"/><w:autoSpaceDN w:val="0"/><w:adjustRightInd w:val="0"/><w:ind w:left="120" w:right="-20"/><w:rPr><w:sz w:val="26"/><w:szCs w:val="26"/></w:rPr></w:pPr></w:p><w:p><w:pPr><w:widowControl w:val="0"/><w:autoSpaceDE w:val="0"/><w:autoSpaceDN w:val="0"/><w:adjustRightInd w:val="0"/><w:ind w:left="120" w:right="-20"/><w:rPr><w:sz w:val="26"/><w:szCs w:val="26"/></w:rPr></w:pPr></w:p><w:p><w:pPr><w:widowControl w:val="0"/><w:autoSpaceDE w:val="0"/><w:autoSpaceDN w:val="0"/><w:adjustRightInd w:val="0"/><w:ind w:left="120" w:right="-20"/><w:rPr><w:sz w:val="26"/><w:szCs w:val="26"/></w:rPr></w:pPr></w:p><w:p><w:pPr><w:widowControl w:val="0"/><w:autoSpaceDE w:val="0"/><w:autoSpaceDN w:val="0"/><w:adjustRightInd w:val="0"/><w:ind w:left="120" w:right="-20"/><w:rPr><w:sz w:val="26"/><w:szCs w:val="26"/></w:rPr></w:pPr></w:p><w:p><w:pPr><w:widowControl w:val="0"/><w:autoSpaceDE w:val="0"/><w:autoSpaceDN w:val="0"/><w:adjustRightInd w:val="0"/><w:ind w:left="120" w:right="-20"/><w:rPr><w:sz w:val="26"/><w:szCs w:val="26"/></w:rPr></w:pPr></w:p><w:p><w:pPr><w:pStyle w:val="Caption"/><w:rPr><w:b/><w:sz w:val="32"/><w:szCs w:val="32"/></w:rPr></w:pPr><w:r><w:rPr><w:b/><w:sz w:val="32"/><w:szCs w:val="32"/></w:rPr><w:t>NHẬN XÉT CỦA GIÁO VIÊN HƯỚNG DẪN</w:t></w:r></w:p><w:p/><w:p/><w:p/><w:p><w:pPr><w:tabs><w:tab w:val="left" w:leader="dot" w:pos="9270"/></w:tabs><w:ind w:firstLine="450"/></w:pPr><w:r><w:lastRenderedPageBreak/><w:tab/></w:r></w:p><w:p><w:pPr><w:tabs><w:tab w:val="left" w:leader="dot" w:pos="9270"/></w:tabs><w:ind w:firstLine="450"/></w:pPr><w:r><w:tab/></w:r></w:p><w:p><w:pPr><w:tabs><w:tab w:val="left" w:leader="dot" w:pos="9270"/></w:tabs><w:ind w:firstLine="450"/></w:pPr><w:r><w:tab/></w:r></w:p><w:p><w:pPr><w:tabs><w:tab w:val="left" w:leader="dot" w:pos="9270"/></w:tabs><w:ind w:firstLine="450"/></w:pPr><w:r><w:tab/></w:r></w:p><w:p><w:pPr><w:tabs><w:tab w:val="left" w:leader="dot" w:pos="9270"/></w:tabs><w:ind w:firstLine="450"/></w:pPr><w:r><w:tab/></w:r></w:p><w:p><w:pPr><w:tabs><w:tab w:val="left" w:leader="dot" w:pos="9270"/></w:tabs><w:ind w:firstLine="450"/></w:pPr><w:r><w:tab/></w:r></w:p><w:p><w:pPr><w:tabs><w:tab w:val="left" w:leader="dot" w:pos="9270"/></w:tabs><w:ind w:firstLine="450"/></w:pPr><w:r><w:tab/></w:r></w:p><w:p><w:pPr><w:tabs><w:tab w:val="left" w:leader="dot" w:pos="9270"/></w:tabs><w:ind w:firstLine="450"/></w:pPr><w:r><w:tab/></w:r></w:p><w:p><w:pPr><w:tabs><w:tab w:val="left" w:leader="dot" w:pos="9270"/></w:tabs><w:ind w:firstLine="450"/></w:pPr><w:r><w:tab/></w:r></w:p><w:p><w:pPr><w:tabs><w:tab w:val="left" w:leader="dot" w:pos="9270"/></w:tabs><w:ind w:firstLine="450"/></w:pPr><w:r><w:tab/></w:r></w:p><w:p><w:pPr><w:tabs><w:tab w:val="left" w:leader="dot" w:pos="9270"/></w:tabs><w:ind w:firstLine="450"/></w:pPr><w:r><w:tab/></w:r></w:p><w:p><w:pPr><w:tabs><w:tab w:val="left" w:leader="dot" w:pos="9270"/></w:tabs><w:ind w:firstLine="450"/></w:pPr><w:r><w:tab/></w:r></w:p><w:p><w:pPr><w:tabs><w:tab w:val="left" w:leader="dot" w:pos="9270"/></w:tabs><w:ind w:firstLine="450"/></w:pPr><w:r><w:tab/></w:r></w:p><w:p><w:pPr><w:tabs><w:tab w:val="left" w:leader="dot" w:pos="9270"/></w:tabs><w:ind w:firstLine="450"/></w:pPr><w:r><w:tab/></w:r></w:p><w:p><w:pPr><w:tabs><w:tab w:val="left" w:leader="dot" w:pos="9270"/></w:tabs><w:ind w:firstLine="450"/></w:pPr><w:r><w:tab/></w:r></w:p><w:p><w:pPr><w:tabs><w:tab w:val="left" w:leader="dot" w:pos="9270"/></w:tabs><w:ind w:firstLine="450"/></w:pPr><w:r><w:tab/></w:r></w:p><w:p><w:pPr><w:tabs><w:tab w:val="left" w:leader="dot" w:pos="9270"/></w:tabs><w:ind w:firstLine="450"/></w:pPr><w:r><w:tab/></w:r></w:p><w:p><w:pPr><w:tabs><w:tab w:val="left" w:leader="dot" w:pos="9270"/></w:tabs><w:ind w:firstLine="450"/></w:pPr><w:r><w:tab/></w:r></w:p><w:p><w:pPr><w:tabs><w:tab w:val="left" w:leader="dot" w:pos="9270"/></w:tabs><w:ind w:firstLine="450"/></w:pPr><w:r><w:tab/></w:r></w:p><w:p><w:pPr><w:tabs><w:tab w:val="left" w:leader="dot" w:pos="9270"/></w:tabs><w:ind w:firstLine="450"/></w:pPr><w:r><w:tab/></w:r></w:p><w:p><w:pPr><w:tabs><w:tab w:val="left" w:leader="dot" w:pos="9270"/></w:tabs><w:ind w:firstLine="450"/></w:pPr><w:r><w:tab/></w:r></w:p><w:p><w:pPr><w:tabs><w:tab w:val="left" w:leader="dot" w:pos="9270"/></w:tabs><w:ind w:firstLine="450"/></w:pPr><w:r><w:tab/></w:r></w:p><w:p><w:pPr><w:tabs><w:tab w:val="left" w:leader="dot" w:pos="9270"/></w:tabs><w:ind w:firstLine="450"/></w:pPr><w:r><w:tab/></w:r></w:p><w:p><w:pPr><w:tabs><w:tab w:val="left" w:leader="dot" w:pos="9270"/></w:tabs><w:ind w:firstLine="450"/></w:pPr><w:r><w:tab/></w:r></w:p><w:p><w:pPr><w:widowControl w:val="0"/><w:autoSpaceDE w:val="0"/><w:autoSpaceDN w:val="0"/><w:adjustRightInd w:val="0"/><w:ind w:left="120" w:right="-20"/><w:rPr><w:sz w:val="26"/><w:szCs w:val="26"/></w:rPr></w:pPr></w:p><w:p><w:pPr><w:widowControl w:val="0"/><w:autoSpaceDE w:val="0"/><w:autoSpaceDN w:val="0"/><w:adjustRightInd w:val="0"/><w:ind w:left="120" w:right="-20"/><w:rPr><w:sz w:val="26"/><w:szCs w:val="26"/></w:rPr></w:pPr></w:p><w:p><w:pPr><w:widowControl w:val="0"/><w:autoSpaceDE w:val="0"/><w:autoSpaceDN w:val="0"/><w:adjustRightInd w:val="0"/><w:ind w:left="120" w:right="-20"/><w:rPr><w:sz w:val="26"/><w:szCs w:val="26"/></w:rPr></w:pPr></w:p><w:p><w:pPr><w:widowControl w:val="0"/><w:autoSpaceDE w:val="0"/><w:autoSpaceDN w:val="0"/><w:adjustRightInd w:val="0"/><w:ind w:left="120" w:right="-20" w:firstLine="600"/><w:rPr><w:b/><w:sz w:val="26"/><w:szCs w:val="26"/></w:rPr></w:pPr><w:r><w:rPr><w:b/><w:sz w:val="26"/><w:szCs w:val="26"/></w:rPr><w:t xml:space="preserve">Điểm lab report: </w:t></w:r></w:p><w:p><w:pPr><w:widowControl w:val="0"/><w:autoSpaceDE w:val="0"/><w:autoSpaceDN w:val="0"/><w:adjustRightInd w:val="0"/><w:ind w:left="120" w:right="-20"/><w:rPr><w:sz w:val="26"/><w:szCs w:val="26"/></w:rPr></w:pPr></w:p><w:p><w:pPr><w:widowControl w:val="0"/><w:autoSpaceDE w:val="0"/><w:autoSpaceDN w:val="0"/><w:adjustRightInd w:val="0"/><w:ind w:left="120" w:right="-20"/><w:rPr><w:sz w:val="26"/><w:szCs w:val="26"/></w:rPr></w:pPr></w:p><w:p><w:pPr><w:widowControl w:val="0"/><w:autoSpaceDE w:val="0"/><w:autoSpaceDN w:val="0"/><w:adjustRightInd w:val="0"/><w:ind w:right="-20"/><w:rPr><w:sz w:val="26"/><w:szCs w:val="26"/></w:rPr></w:pPr></w:p><w:p><w:pPr><w:jc w:val="both"/><w:rPr><w:b/><w:sz w:val="26"/><w:szCs w:val="26"/></w:rPr></w:pPr></w:p><w:p><w:pPr><w:jc w:val="both"/><w:rPr><w:b/><w:sz w:val="26"/><w:szCs w:val="26"/></w:rPr></w:pPr></w:p><w:p><w:pPr><w:jc w:val="both"/><w:rPr><w:b/><w:sz w:val="26"/><w:szCs w:val="26"/></w:rPr></w:pPr></w:p><w:p><w:pPr><w:jc w:val="both"/><w:rPr><w:b/><w:sz w:val="26"/><w:szCs w:val="26"/></w:rPr></w:pPr></w:p><w:p><w:pPr><w:jc w:val="both"/><w:rPr><w:b/><w:sz w:val="26"/><w:szCs w:val="26"/></w:rPr></w:pPr></w:p><w:p><w:pPr><w:jc w:val="both"/><w:rPr><w:b/><w:sz w:val="26"/><w:szCs w:val="26"/></w:rPr></w:pPr></w:p><w:p><w:pPr><w:jc w:val="both"/><w:rPr><w:b/><w:sz w:val="26"/><w:szCs w:val="26"/></w:rPr></w:pPr></w:p><w:p><w:pPr><w:jc w:val="both"/><w:rPr><w:b/><w:sz w:val="26"/><w:szCs w:val="26"/></w:rPr></w:pPr></w:p><w:p><w:pPr><w:jc w:val="both"/><w:rPr><w:b/><w:sz w:val="26"/><w:szCs w:val="26"/></w:rPr></w:pPr></w:p><w:p><w:pPr><w:jc w:val="both"/><w:rPr><w:b/><w:sz w:val="26"/><w:szCs w:val="26"/></w:rPr></w:pPr></w:p><w:p><w:pPr><w:jc w:val="both"/><w:rPr><w:b/><w:sz w:val="26"/><w:szCs w:val="26"/></w:rPr></w:pPr></w:p><w:p><w:pPr><w:jc w:val="center"/><w:rPr><w:b/><w:sz w:val="26"/><w:szCs w:val="26"/></w:rPr></w:pPr><w:r><w:rPr><w:b/><w:sz w:val="26"/><w:szCs w:val="26"/></w:rPr><w:t xml:space="preserve">PHẦN BÀI LÀM </w:t></w:r></w:p><w:p>
-  <w:pPr>
-    <w:spacing w:before="120" w:after="80" w:line="324" w:lineRule="auto"/>
-    <w:rPr><w:b/><w:sz w:val="26"/><w:szCs w:val="26"/><w:lang w:val="vi-VN"/></w:rPr>
-  </w:pPr>
-  <w:r>
-    <w:rPr><w:b/><w:sz w:val="26"/><w:szCs w:val="26"/><w:lang w:val="vi-VN"/></w:rPr>
-    <w:t xml:space="preserve">Link GitHub cá nhân chứa source code: </w:t>
-  </w:r>
-  <w:hyperlink r:id="rId11" w:history="1">
-    <w:r>
-      <w:rPr>
-        <w:rStyle w:val="Hyperlink"/>
-        <w:b/>
-        <w:color w:val="0563C1"/>
-        <w:u w:val="single"/>
-        <w:sz w:val="26"/>
-        <w:szCs w:val="26"/>
-      </w:rPr>
-      <w:t>https://github.com/Cal-105/ptthth_21bvl_25765261</w:t>
-    </w:r>
-  </w:hyperlink>
-</w:p><w:p>
+<file path=word/document.xml><?xml version="1.0" encoding="utf-8"?>
+<w:document xmlns:wpc="http://schemas.microsoft.com/office/word/2010/wordprocessingCanvas" xmlns:cx="http://schemas.microsoft.com/office/drawing/2014/chartex" xmlns:cx1="http://schemas.microsoft.com/office/drawing/2015/9/8/chartex" xmlns:cx2="http://schemas.microsoft.com/office/drawing/2015/10/21/chartex" xmlns:cx3="http://schemas.microsoft.com/office/drawing/2016/5/9/chartex" xmlns:cx4="http://schemas.microsoft.com/office/drawing/2016/5/10/chartex" xmlns:cx5="http://schemas.microsoft.com/office/drawing/2016/5/11/chartex" xmlns:cx6="http://schemas.microsoft.com/office/drawing/2016/5/12/chartex" xmlns:cx7="http://schemas.microsoft.com/office/drawing/2016/5/13/chartex" xmlns:cx8="http://schemas.microsoft.com/office/drawing/2016/5/14/chartex" xmlns:mc="http://schemas.openxmlformats.org/markup-compatibility/2006" xmlns:aink="http://schemas.microsoft.com/office/drawing/2016/ink" xmlns:am3d="http://schemas.microsoft.com/office/drawing/2017/model3d" xmlns:o="urn:schemas-microsoft-com:office:office" xmlns:oel="http://schemas.microsoft.com/office/2019/extlst" xmlns:r="http://schemas.openxmlformats.org/officeDocument/2006/relationships" xmlns:m="http://schemas.openxmlformats.org/officeDocument/2006/math" xmlns:v="urn:schemas-microsoft-com:vml" xmlns:wp14="http://schemas.microsoft.com/office/word/2010/wordprocessingDrawing" xmlns:wp="http://schemas.openxmlformats.org/drawingml/2006/wordprocessingDrawing" xmlns:w10="urn:schemas-microsoft-com:office:word" xmlns:w="http://schemas.openxmlformats.org/wordprocessingml/2006/main" xmlns:w14="http://schemas.microsoft.com/office/word/2010/wordml" xmlns:w15="http://schemas.microsoft.com/office/word/2012/wordml" xmlns:w16cex="http://schemas.microsoft.com/office/word/2018/wordml/cex" xmlns:w16cid="http://schemas.microsoft.com/office/word/2016/wordml/cid" xmlns:w16="http://schemas.microsoft.com/office/word/2018/wordml" xmlns:w16sdtdh="http://schemas.microsoft.com/office/word/2020/wordml/sdtdatahash" xmlns:w16se="http://schemas.microsoft.com/office/word/2015/wordml/symex" xmlns:wpg="http://schemas.microsoft.com/office/word/2010/wordprocessingGroup" xmlns:wpi="http://schemas.microsoft.com/office/word/2010/wordprocessingInk" xmlns:wne="http://schemas.microsoft.com/office/word/2006/wordml" xmlns:wps="http://schemas.microsoft.com/office/word/2010/wordprocessingShape" mc:Ignorable="w14 w15 w16se w16cid w16 w16cex w16sdtdh wp14">
+  <w:body>
+    <w:p>
+      <w:pPr>
+        <w:spacing w:before="40" w:after="40" w:line="360" w:lineRule="exact"/>
+        <w:jc w:val="center"/>
+        <w:rPr>
+          <w:b/>
+        </w:rPr>
+      </w:pPr>
+      <w:r>
+        <w:rPr>
+          <w:b/>
+          <w:noProof/>
+        </w:rPr>
+        <w:drawing>
+          <wp:anchor distT="0" distB="0" distL="114300" distR="114300" simplePos="0" relativeHeight="251660288" behindDoc="1" locked="0" layoutInCell="1" allowOverlap="1" wp14:anchorId="74DB7995" wp14:editId="22D450C0">
+            <wp:simplePos x="0" y="0"/>
+            <wp:positionH relativeFrom="column">
+              <wp:posOffset>100330</wp:posOffset>
+            </wp:positionH>
+            <wp:positionV relativeFrom="paragraph">
+              <wp:posOffset>-137795</wp:posOffset>
+            </wp:positionV>
+            <wp:extent cx="1774190" cy="705485"/>
+            <wp:effectExtent l="0" t="0" r="0" b="0"/>
+            <wp:wrapNone/>
+            <wp:docPr id="98" name="Picture 98" descr="Logo"/>
+            <wp:cNvGraphicFramePr>
+              <a:graphicFrameLocks xmlns:a="http://schemas.openxmlformats.org/drawingml/2006/main" noChangeAspect="1"/>
+            </wp:cNvGraphicFramePr>
+            <a:graphic xmlns:a="http://schemas.openxmlformats.org/drawingml/2006/main">
+              <a:graphicData uri="http://schemas.openxmlformats.org/drawingml/2006/picture">
+                <pic:pic xmlns:pic="http://schemas.openxmlformats.org/drawingml/2006/picture">
+                  <pic:nvPicPr>
+                    <pic:cNvPr id="98" name="Picture 98" descr="Logo"/>
+                    <pic:cNvPicPr>
+                      <a:picLocks noChangeAspect="1" noChangeArrowheads="1"/>
+                    </pic:cNvPicPr>
+                  </pic:nvPicPr>
+                  <pic:blipFill>
+                    <a:blip r:embed="rId8">
+                      <a:extLst>
+                        <a:ext uri="{28A0092B-C50C-407E-A947-70E740481C1C}">
+                          <a14:useLocalDpi xmlns:a14="http://schemas.microsoft.com/office/drawing/2010/main" val="0"/>
+                        </a:ext>
+                      </a:extLst>
+                    </a:blip>
+                    <a:srcRect/>
+                    <a:stretch>
+                      <a:fillRect/>
+                    </a:stretch>
+                  </pic:blipFill>
+                  <pic:spPr>
+                    <a:xfrm>
+                      <a:off x="0" y="0"/>
+                      <a:ext cx="1774190" cy="705485"/>
+                    </a:xfrm>
+                    <a:prstGeom prst="rect">
+                      <a:avLst/>
+                    </a:prstGeom>
+                    <a:noFill/>
+                    <a:ln>
+                      <a:noFill/>
+                    </a:ln>
+                  </pic:spPr>
+                </pic:pic>
+              </a:graphicData>
+            </a:graphic>
+          </wp:anchor>
+        </w:drawing>
+      </w:r>
+    </w:p>
+    <w:p>
+      <w:pPr>
+        <w:spacing w:before="40" w:after="40" w:line="360" w:lineRule="exact"/>
+        <w:jc w:val="center"/>
+        <w:rPr>
+          <w:b/>
+          <w:sz w:val="36"/>
+          <w:szCs w:val="36"/>
+        </w:rPr>
+      </w:pPr>
+      <w:r>
+        <w:rPr>
+          <w:b/>
+          <w:sz w:val="36"/>
+          <w:szCs w:val="36"/>
+        </w:rPr>
+        <w:t>BỘ CÔNG THƯƠNG</w:t>
+      </w:r>
+    </w:p>
+    <w:p>
+      <w:pPr>
+        <w:spacing w:before="40" w:after="40" w:line="360" w:lineRule="exact"/>
+        <w:jc w:val="center"/>
+        <w:rPr>
+          <w:sz w:val="30"/>
+          <w:szCs w:val="30"/>
+        </w:rPr>
+      </w:pPr>
+      <w:r>
+        <w:rPr>
+          <w:b/>
+          <w:sz w:val="30"/>
+          <w:szCs w:val="30"/>
+        </w:rPr>
+        <w:t xml:space="preserve">TRƯỜNG ĐẠI HỌC CÔNG NGHIỆP TP HỒ CHÍ MINH </w:t>
+      </w:r>
+    </w:p>
+    <w:p>
+      <w:pPr>
+        <w:spacing w:before="40" w:after="40" w:line="360" w:lineRule="exact"/>
+        <w:jc w:val="center"/>
+      </w:pPr>
+      <w:r>
+        <w:t>----------------------</w:t>
+      </w:r>
+    </w:p>
+    <w:p>
+      <w:pPr>
+        <w:spacing w:before="40" w:after="40" w:line="360" w:lineRule="exact"/>
+        <w:jc w:val="center"/>
+        <w:rPr>
+          <w:b/>
+          <w:sz w:val="28"/>
+        </w:rPr>
+      </w:pPr>
+      <w:r>
+        <w:rPr>
+          <w:b/>
+          <w:sz w:val="28"/>
+        </w:rPr>
+        <w:t>Khoa: Công Nghệ Thông Tin</w:t>
+      </w:r>
+    </w:p>
+    <w:p>
+      <w:pPr>
+        <w:widowControl w:val="0"/>
+        <w:autoSpaceDE w:val="0"/>
+        <w:autoSpaceDN w:val="0"/>
+        <w:adjustRightInd w:val="0"/>
+        <w:ind w:left="120" w:right="-20"/>
+        <w:rPr>
+          <w:sz w:val="26"/>
+          <w:szCs w:val="26"/>
+        </w:rPr>
+      </w:pPr>
+    </w:p>
+    <w:p>
+      <w:pPr>
+        <w:widowControl w:val="0"/>
+        <w:autoSpaceDE w:val="0"/>
+        <w:autoSpaceDN w:val="0"/>
+        <w:adjustRightInd w:val="0"/>
+        <w:ind w:left="120" w:right="-20"/>
+        <w:rPr>
+          <w:sz w:val="26"/>
+          <w:szCs w:val="26"/>
+        </w:rPr>
+      </w:pPr>
+    </w:p>
+    <w:p>
+      <w:pPr>
+        <w:widowControl w:val="0"/>
+        <w:autoSpaceDE w:val="0"/>
+        <w:autoSpaceDN w:val="0"/>
+        <w:adjustRightInd w:val="0"/>
+        <w:ind w:left="120" w:right="-20"/>
+        <w:rPr>
+          <w:sz w:val="26"/>
+          <w:szCs w:val="26"/>
+        </w:rPr>
+      </w:pPr>
+      <w:r>
+        <w:rPr>
+          <w:noProof/>
+          <w:sz w:val="26"/>
+          <w:szCs w:val="26"/>
+        </w:rPr>
+        <mc:AlternateContent>
+          <mc:Choice Requires="wps">
+            <w:drawing>
+              <wp:anchor distT="0" distB="0" distL="114300" distR="114300" simplePos="0" relativeHeight="251661312" behindDoc="0" locked="0" layoutInCell="1" allowOverlap="1" wp14:anchorId="462AA6E6" wp14:editId="6D519487">
+                <wp:simplePos x="0" y="0"/>
+                <wp:positionH relativeFrom="column">
+                  <wp:posOffset>1481455</wp:posOffset>
+                </wp:positionH>
+                <wp:positionV relativeFrom="paragraph">
+                  <wp:posOffset>76200</wp:posOffset>
+                </wp:positionV>
+                <wp:extent cx="3279140" cy="1616075"/>
+                <wp:effectExtent l="0" t="0" r="16510" b="22860"/>
+                <wp:wrapNone/>
+                <wp:docPr id="4" name="Rounded Rectangle 4"/>
+                <wp:cNvGraphicFramePr/>
+                <a:graphic xmlns:a="http://schemas.openxmlformats.org/drawingml/2006/main">
+                  <a:graphicData uri="http://schemas.microsoft.com/office/word/2010/wordprocessingShape">
+                    <wps:wsp>
+                      <wps:cNvSpPr/>
+                      <wps:spPr>
+                        <a:xfrm>
+                          <a:off x="0" y="0"/>
+                          <a:ext cx="3279227" cy="1615965"/>
+                        </a:xfrm>
+                        <a:prstGeom prst="roundRect">
+                          <a:avLst/>
+                        </a:prstGeom>
+                        <a:blipFill dpi="0" rotWithShape="1">
+                          <a:blip r:embed="rId9">
+                            <a:extLst>
+                              <a:ext uri="{28A0092B-C50C-407E-A947-70E740481C1C}">
+                                <a14:useLocalDpi xmlns:a14="http://schemas.microsoft.com/office/drawing/2010/main" val="0"/>
+                              </a:ext>
+                            </a:extLst>
+                          </a:blip>
+                          <a:srcRect/>
+                          <a:stretch>
+                            <a:fillRect/>
+                          </a:stretch>
+                        </a:blipFill>
+                      </wps:spPr>
+                      <wps:style>
+                        <a:lnRef idx="2">
+                          <a:schemeClr val="accent1">
+                            <a:shade val="50000"/>
+                          </a:schemeClr>
+                        </a:lnRef>
+                        <a:fillRef idx="1">
+                          <a:schemeClr val="accent1"/>
+                        </a:fillRef>
+                        <a:effectRef idx="0">
+                          <a:schemeClr val="accent1"/>
+                        </a:effectRef>
+                        <a:fontRef idx="minor">
+                          <a:schemeClr val="lt1"/>
+                        </a:fontRef>
+                      </wps:style>
+                      <wps:bodyPr rot="0" spcFirstLastPara="0" vertOverflow="overflow" horzOverflow="overflow" vert="horz" wrap="square" lIns="91440" tIns="45720" rIns="91440" bIns="45720" numCol="1" spcCol="0" rtlCol="0" fromWordArt="0" anchor="ctr" anchorCtr="0" forceAA="0" compatLnSpc="1">
+                        <a:noAutofit/>
+                      </wps:bodyPr>
+                    </wps:wsp>
+                  </a:graphicData>
+                </a:graphic>
+              </wp:anchor>
+            </w:drawing>
+          </mc:Choice>
+          <mc:Fallback xmlns:wpsCustomData="http://www.wps.cn/officeDocument/2013/wpsCustomData">
+            <w:pict>
+              <v:roundrect id="_x0000_s1026" o:spid="_x0000_s1026" o:spt="2" style="position:absolute;left:0pt;margin-left:116.65pt;margin-top:6pt;height:127.25pt;width:258.2pt;z-index:251661312;v-text-anchor:middle;mso-width-relative:page;mso-height-relative:page;" filled="t" stroked="t" coordsize="21600,21600" arcsize="0.166666666666667" o:gfxdata="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">
+                <v:fill type="frame" on="t" focussize="0,0" recolor="t" rotate="t" r:id="rId10"/>
+                <v:stroke weight="1pt" color="#2F528F [3204]" miterlimit="8" joinstyle="miter"/>
+                <v:imagedata o:title=""/>
+                <o:lock v:ext="edit" aspectratio="f"/>
+              </v:roundrect>
+            </w:pict>
+          </mc:Fallback>
+        </mc:AlternateContent>
+      </w:r>
+    </w:p>
+    <w:p>
+      <w:pPr>
+        <w:widowControl w:val="0"/>
+        <w:autoSpaceDE w:val="0"/>
+        <w:autoSpaceDN w:val="0"/>
+        <w:adjustRightInd w:val="0"/>
+        <w:ind w:left="120" w:right="-20"/>
+        <w:rPr>
+          <w:sz w:val="26"/>
+          <w:szCs w:val="26"/>
+        </w:rPr>
+      </w:pPr>
+    </w:p>
+    <w:p>
+      <w:pPr>
+        <w:widowControl w:val="0"/>
+        <w:autoSpaceDE w:val="0"/>
+        <w:autoSpaceDN w:val="0"/>
+        <w:adjustRightInd w:val="0"/>
+        <w:ind w:left="120" w:right="-20"/>
+        <w:rPr>
+          <w:sz w:val="26"/>
+          <w:szCs w:val="26"/>
+        </w:rPr>
+      </w:pPr>
+    </w:p>
+    <w:p>
+      <w:pPr>
+        <w:widowControl w:val="0"/>
+        <w:autoSpaceDE w:val="0"/>
+        <w:autoSpaceDN w:val="0"/>
+        <w:adjustRightInd w:val="0"/>
+        <w:ind w:left="120" w:right="-20"/>
+        <w:rPr>
+          <w:sz w:val="26"/>
+          <w:szCs w:val="26"/>
+        </w:rPr>
+      </w:pPr>
+    </w:p>
+    <w:p>
+      <w:pPr>
+        <w:widowControl w:val="0"/>
+        <w:autoSpaceDE w:val="0"/>
+        <w:autoSpaceDN w:val="0"/>
+        <w:adjustRightInd w:val="0"/>
+        <w:ind w:left="120" w:right="-20"/>
+        <w:rPr>
+          <w:sz w:val="26"/>
+          <w:szCs w:val="26"/>
+        </w:rPr>
+      </w:pPr>
+    </w:p>
+    <w:p>
+      <w:pPr>
+        <w:widowControl w:val="0"/>
+        <w:autoSpaceDE w:val="0"/>
+        <w:autoSpaceDN w:val="0"/>
+        <w:adjustRightInd w:val="0"/>
+        <w:ind w:left="120" w:right="-20"/>
+        <w:rPr>
+          <w:sz w:val="26"/>
+          <w:szCs w:val="26"/>
+        </w:rPr>
+      </w:pPr>
+    </w:p>
+    <w:p>
+      <w:pPr>
+        <w:widowControl w:val="0"/>
+        <w:autoSpaceDE w:val="0"/>
+        <w:autoSpaceDN w:val="0"/>
+        <w:adjustRightInd w:val="0"/>
+        <w:ind w:left="120" w:right="-20"/>
+        <w:rPr>
+          <w:sz w:val="26"/>
+          <w:szCs w:val="26"/>
+        </w:rPr>
+      </w:pPr>
+    </w:p>
+    <w:p>
+      <w:pPr>
+        <w:widowControl w:val="0"/>
+        <w:autoSpaceDE w:val="0"/>
+        <w:autoSpaceDN w:val="0"/>
+        <w:adjustRightInd w:val="0"/>
+        <w:ind w:left="120" w:right="-20"/>
+        <w:rPr>
+          <w:sz w:val="26"/>
+          <w:szCs w:val="26"/>
+        </w:rPr>
+      </w:pPr>
+    </w:p>
+    <w:p>
+      <w:pPr>
+        <w:widowControl w:val="0"/>
+        <w:autoSpaceDE w:val="0"/>
+        <w:autoSpaceDN w:val="0"/>
+        <w:adjustRightInd w:val="0"/>
+        <w:ind w:left="120" w:right="-20"/>
+        <w:rPr>
+          <w:sz w:val="26"/>
+          <w:szCs w:val="26"/>
+        </w:rPr>
+      </w:pPr>
+    </w:p>
+    <w:p>
+      <w:pPr>
+        <w:widowControl w:val="0"/>
+        <w:autoSpaceDE w:val="0"/>
+        <w:autoSpaceDN w:val="0"/>
+        <w:adjustRightInd w:val="0"/>
+        <w:ind w:left="120" w:right="-20"/>
+        <w:rPr>
+          <w:sz w:val="26"/>
+          <w:szCs w:val="26"/>
+        </w:rPr>
+      </w:pPr>
+    </w:p>
+    <w:p>
+      <w:pPr>
+        <w:widowControl w:val="0"/>
+        <w:autoSpaceDE w:val="0"/>
+        <w:autoSpaceDN w:val="0"/>
+        <w:adjustRightInd w:val="0"/>
+        <w:ind w:left="120" w:right="-20"/>
+        <w:rPr>
+          <w:sz w:val="26"/>
+          <w:szCs w:val="26"/>
+        </w:rPr>
+      </w:pPr>
+    </w:p>
+    <w:p>
+      <w:pPr>
+        <w:widowControl w:val="0"/>
+        <w:autoSpaceDE w:val="0"/>
+        <w:autoSpaceDN w:val="0"/>
+        <w:adjustRightInd w:val="0"/>
+        <w:ind w:left="120" w:right="-20"/>
+        <w:rPr>
+          <w:sz w:val="26"/>
+          <w:szCs w:val="26"/>
+        </w:rPr>
+      </w:pPr>
+    </w:p>
+    <w:p>
+      <w:pPr>
+        <w:widowControl w:val="0"/>
+        <w:autoSpaceDE w:val="0"/>
+        <w:autoSpaceDN w:val="0"/>
+        <w:adjustRightInd w:val="0"/>
+        <w:ind w:left="120" w:right="-20"/>
+        <w:rPr>
+          <w:sz w:val="26"/>
+          <w:szCs w:val="26"/>
+        </w:rPr>
+      </w:pPr>
+    </w:p>
+    <w:p>
+      <w:pPr>
+        <w:widowControl w:val="0"/>
+        <w:autoSpaceDE w:val="0"/>
+        <w:autoSpaceDN w:val="0"/>
+        <w:adjustRightInd w:val="0"/>
+        <w:ind w:left="120" w:right="-20"/>
+        <w:rPr>
+          <w:sz w:val="26"/>
+          <w:szCs w:val="26"/>
+        </w:rPr>
+      </w:pPr>
+    </w:p>
+    <w:p>
+      <w:pPr>
+        <w:widowControl w:val="0"/>
+        <w:autoSpaceDE w:val="0"/>
+        <w:autoSpaceDN w:val="0"/>
+        <w:adjustRightInd w:val="0"/>
+        <w:ind w:left="120" w:right="-20"/>
+        <w:rPr>
+          <w:sz w:val="26"/>
+          <w:szCs w:val="26"/>
+        </w:rPr>
+      </w:pPr>
+    </w:p>
+    <w:p>
+      <w:pPr>
+        <w:widowControl w:val="0"/>
+        <w:autoSpaceDE w:val="0"/>
+        <w:autoSpaceDN w:val="0"/>
+        <w:adjustRightInd w:val="0"/>
+        <w:ind w:left="120" w:right="-20"/>
+        <w:rPr>
+          <w:sz w:val="26"/>
+          <w:szCs w:val="26"/>
+        </w:rPr>
+      </w:pPr>
+    </w:p>
+    <w:p>
+      <w:pPr>
+        <w:ind w:firstLine="360"/>
+        <w:rPr>
+          <w:sz w:val="44"/>
+          <w:szCs w:val="44"/>
+        </w:rPr>
+      </w:pPr>
+      <w:r>
+        <w:rPr>
+          <w:sz w:val="44"/>
+          <w:szCs w:val="44"/>
+        </w:rPr>
+        <w:t>Student’s Name</w:t>
+      </w:r>
+      <w:proofErr w:type="gramStart"/>
+      <w:r>
+        <w:rPr>
+          <w:sz w:val="44"/>
+          <w:szCs w:val="44"/>
+        </w:rPr>
+        <w:tab/>
+        <w:t>:Nguyễn</w:t>
+      </w:r>
+      <w:proofErr w:type="gramEnd"/>
+      <w:r>
+        <w:rPr>
+          <w:sz w:val="44"/>
+          <w:szCs w:val="44"/>
+        </w:rPr>
+        <w:t xml:space="preserve"> Văn Cal</w:t>
+      </w:r>
+    </w:p>
+    <w:p>
+      <w:pPr>
+        <w:tabs>
+          <w:tab w:val="left" w:pos="2160"/>
+        </w:tabs>
+        <w:ind w:firstLine="360"/>
+        <w:rPr>
+          <w:sz w:val="44"/>
+          <w:szCs w:val="44"/>
+        </w:rPr>
+      </w:pPr>
+      <w:r>
+        <w:rPr>
+          <w:sz w:val="44"/>
+          <w:szCs w:val="44"/>
+        </w:rPr>
+        <w:t>Class Code</w:t>
+      </w:r>
+      <w:r>
+        <w:rPr>
+          <w:sz w:val="44"/>
+          <w:szCs w:val="44"/>
+        </w:rPr>
+        <w:tab/>
+      </w:r>
+      <w:r>
+        <w:rPr>
+          <w:sz w:val="44"/>
+          <w:szCs w:val="44"/>
+        </w:rPr>
+        <w:tab/>
+        <w:t>:</w:t>
+      </w:r>
+    </w:p>
+    <w:p>
+      <w:pPr>
+        <w:tabs>
+          <w:tab w:val="left" w:pos="2160"/>
+        </w:tabs>
+        <w:ind w:firstLine="360"/>
+        <w:rPr>
+          <w:sz w:val="36"/>
+          <w:szCs w:val="36"/>
+        </w:rPr>
+      </w:pPr>
+      <w:r>
+        <w:rPr>
+          <w:sz w:val="44"/>
+          <w:szCs w:val="44"/>
+        </w:rPr>
+        <w:t>Subject</w:t>
+      </w:r>
+      <w:r>
+        <w:rPr>
+          <w:sz w:val="44"/>
+          <w:szCs w:val="44"/>
+        </w:rPr>
+        <w:tab/>
+      </w:r>
+      <w:r>
+        <w:rPr>
+          <w:sz w:val="44"/>
+          <w:szCs w:val="44"/>
+        </w:rPr>
+        <w:tab/>
+      </w:r>
+      <w:r>
+        <w:rPr>
+          <w:sz w:val="44"/>
+          <w:szCs w:val="44"/>
+        </w:rPr>
+        <w:tab/>
+        <w:t>:</w:t>
+      </w:r>
+    </w:p>
+    <w:p>
+      <w:pPr>
+        <w:tabs>
+          <w:tab w:val="left" w:pos="2160"/>
+        </w:tabs>
+        <w:ind w:firstLine="360"/>
+        <w:rPr>
+          <w:sz w:val="44"/>
+          <w:szCs w:val="44"/>
+        </w:rPr>
+      </w:pPr>
+      <w:r>
+        <w:rPr>
+          <w:sz w:val="44"/>
+          <w:szCs w:val="44"/>
+        </w:rPr>
+        <w:t>Instructor</w:t>
+      </w:r>
+      <w:r>
+        <w:rPr>
+          <w:sz w:val="44"/>
+          <w:szCs w:val="44"/>
+        </w:rPr>
+        <w:tab/>
+      </w:r>
+      <w:r>
+        <w:rPr>
+          <w:sz w:val="44"/>
+          <w:szCs w:val="44"/>
+        </w:rPr>
+        <w:tab/>
+      </w:r>
+      <w:r>
+        <w:rPr>
+          <w:sz w:val="44"/>
+          <w:szCs w:val="44"/>
+        </w:rPr>
+        <w:tab/>
+        <w:t>:</w:t>
+      </w:r>
+    </w:p>
+    <w:p>
+      <w:pPr>
+        <w:ind w:firstLine="360"/>
+        <w:rPr>
+          <w:sz w:val="44"/>
+          <w:szCs w:val="44"/>
+        </w:rPr>
+      </w:pPr>
+      <w:r>
+        <w:rPr>
+          <w:sz w:val="44"/>
+          <w:szCs w:val="44"/>
+        </w:rPr>
+        <w:t>Faculty</w:t>
+      </w:r>
+      <w:r>
+        <w:rPr>
+          <w:sz w:val="44"/>
+          <w:szCs w:val="44"/>
+        </w:rPr>
+        <w:tab/>
+      </w:r>
+      <w:r>
+        <w:rPr>
+          <w:sz w:val="44"/>
+          <w:szCs w:val="44"/>
+        </w:rPr>
+        <w:tab/>
+      </w:r>
+      <w:r>
+        <w:rPr>
+          <w:sz w:val="44"/>
+          <w:szCs w:val="44"/>
+        </w:rPr>
+        <w:tab/>
+        <w:t>:</w:t>
+      </w:r>
+    </w:p>
+    <w:p>
+      <w:pPr>
+        <w:ind w:firstLine="360"/>
+        <w:rPr>
+          <w:sz w:val="44"/>
+          <w:szCs w:val="44"/>
+        </w:rPr>
+      </w:pPr>
+      <w:r>
+        <w:rPr>
+          <w:sz w:val="44"/>
+          <w:szCs w:val="44"/>
+        </w:rPr>
+        <w:t>Completed Date</w:t>
+      </w:r>
+      <w:r>
+        <w:rPr>
+          <w:sz w:val="44"/>
+          <w:szCs w:val="44"/>
+        </w:rPr>
+        <w:tab/>
+        <w:t>:</w:t>
+      </w:r>
+    </w:p>
+    <w:p>
+      <w:pPr>
+        <w:widowControl w:val="0"/>
+        <w:autoSpaceDE w:val="0"/>
+        <w:autoSpaceDN w:val="0"/>
+        <w:adjustRightInd w:val="0"/>
+        <w:ind w:left="120" w:right="-20"/>
+        <w:rPr>
+          <w:sz w:val="26"/>
+          <w:szCs w:val="26"/>
+        </w:rPr>
+      </w:pPr>
+    </w:p>
+    <w:p>
+      <w:pPr>
+        <w:widowControl w:val="0"/>
+        <w:autoSpaceDE w:val="0"/>
+        <w:autoSpaceDN w:val="0"/>
+        <w:adjustRightInd w:val="0"/>
+        <w:ind w:left="120" w:right="-20"/>
+        <w:rPr>
+          <w:sz w:val="26"/>
+          <w:szCs w:val="26"/>
+        </w:rPr>
+      </w:pPr>
+    </w:p>
+    <w:p>
+      <w:pPr>
+        <w:widowControl w:val="0"/>
+        <w:autoSpaceDE w:val="0"/>
+        <w:autoSpaceDN w:val="0"/>
+        <w:adjustRightInd w:val="0"/>
+        <w:ind w:left="120" w:right="-20"/>
+        <w:rPr>
+          <w:sz w:val="26"/>
+          <w:szCs w:val="26"/>
+        </w:rPr>
+      </w:pPr>
+    </w:p>
+    <w:p>
+      <w:pPr>
+        <w:widowControl w:val="0"/>
+        <w:autoSpaceDE w:val="0"/>
+        <w:autoSpaceDN w:val="0"/>
+        <w:adjustRightInd w:val="0"/>
+        <w:ind w:left="120" w:right="-20"/>
+        <w:rPr>
+          <w:sz w:val="26"/>
+          <w:szCs w:val="26"/>
+        </w:rPr>
+      </w:pPr>
+    </w:p>
+    <w:p>
+      <w:pPr>
+        <w:widowControl w:val="0"/>
+        <w:autoSpaceDE w:val="0"/>
+        <w:autoSpaceDN w:val="0"/>
+        <w:adjustRightInd w:val="0"/>
+        <w:ind w:left="120" w:right="-20"/>
+        <w:rPr>
+          <w:sz w:val="26"/>
+          <w:szCs w:val="26"/>
+        </w:rPr>
+      </w:pPr>
+    </w:p>
+    <w:p>
+      <w:pPr>
+        <w:pStyle w:val="Caption"/>
+        <w:rPr>
+          <w:b/>
+          <w:sz w:val="32"/>
+          <w:szCs w:val="32"/>
+        </w:rPr>
+      </w:pPr>
+      <w:r>
+        <w:rPr>
+          <w:b/>
+          <w:sz w:val="32"/>
+          <w:szCs w:val="32"/>
+        </w:rPr>
+        <w:t>NHẬN XÉT CỦA GIÁO VIÊN HƯỚNG DẪN</w:t>
+      </w:r>
+    </w:p>
+    <w:p/>
+    <w:p/>
+    <w:p/>
+    <w:p>
+      <w:pPr>
+        <w:tabs>
+          <w:tab w:val="left" w:leader="dot" w:pos="9270"/>
+        </w:tabs>
+        <w:ind w:firstLine="450"/>
+      </w:pPr>
+      <w:r>
+        <w:lastRenderedPageBreak/>
+        <w:tab/>
+      </w:r>
+    </w:p>
+    <w:p>
+      <w:pPr>
+        <w:tabs>
+          <w:tab w:val="left" w:leader="dot" w:pos="9270"/>
+        </w:tabs>
+        <w:ind w:firstLine="450"/>
+      </w:pPr>
+      <w:r>
+        <w:tab/>
+      </w:r>
+    </w:p>
+    <w:p>
+      <w:pPr>
+        <w:tabs>
+          <w:tab w:val="left" w:leader="dot" w:pos="9270"/>
+        </w:tabs>
+        <w:ind w:firstLine="450"/>
+      </w:pPr>
+      <w:r>
+        <w:tab/>
+      </w:r>
+    </w:p>
+    <w:p>
+      <w:pPr>
+        <w:tabs>
+          <w:tab w:val="left" w:leader="dot" w:pos="9270"/>
+        </w:tabs>
+        <w:ind w:firstLine="450"/>
+      </w:pPr>
+      <w:r>
+        <w:tab/>
+      </w:r>
+    </w:p>
+    <w:p>
+      <w:pPr>
+        <w:tabs>
+          <w:tab w:val="left" w:leader="dot" w:pos="9270"/>
+        </w:tabs>
+        <w:ind w:firstLine="450"/>
+      </w:pPr>
+      <w:r>
+        <w:tab/>
+      </w:r>
+    </w:p>
+    <w:p>
+      <w:pPr>
+        <w:tabs>
+          <w:tab w:val="left" w:leader="dot" w:pos="9270"/>
+        </w:tabs>
+        <w:ind w:firstLine="450"/>
+      </w:pPr>
+      <w:r>
+        <w:tab/>
+      </w:r>
+    </w:p>
+    <w:p>
+      <w:pPr>
+        <w:tabs>
+          <w:tab w:val="left" w:leader="dot" w:pos="9270"/>
+        </w:tabs>
+        <w:ind w:firstLine="450"/>
+      </w:pPr>
+      <w:r>
+        <w:tab/>
+      </w:r>
+    </w:p>
+    <w:p>
+      <w:pPr>
+        <w:tabs>
+          <w:tab w:val="left" w:leader="dot" w:pos="9270"/>
+        </w:tabs>
+        <w:ind w:firstLine="450"/>
+      </w:pPr>
+      <w:r>
+        <w:tab/>
+      </w:r>
+    </w:p>
+    <w:p>
+      <w:pPr>
+        <w:tabs>
+          <w:tab w:val="left" w:leader="dot" w:pos="9270"/>
+        </w:tabs>
+        <w:ind w:firstLine="450"/>
+      </w:pPr>
+      <w:r>
+        <w:tab/>
+      </w:r>
+    </w:p>
+    <w:p>
+      <w:pPr>
+        <w:tabs>
+          <w:tab w:val="left" w:leader="dot" w:pos="9270"/>
+        </w:tabs>
+        <w:ind w:firstLine="450"/>
+      </w:pPr>
+      <w:r>
+        <w:tab/>
+      </w:r>
+    </w:p>
+    <w:p>
+      <w:pPr>
+        <w:tabs>
+          <w:tab w:val="left" w:leader="dot" w:pos="9270"/>
+        </w:tabs>
+        <w:ind w:firstLine="450"/>
+      </w:pPr>
+      <w:r>
+        <w:tab/>
+      </w:r>
+    </w:p>
+    <w:p>
+      <w:pPr>
+        <w:tabs>
+          <w:tab w:val="left" w:leader="dot" w:pos="9270"/>
+        </w:tabs>
+        <w:ind w:firstLine="450"/>
+      </w:pPr>
+      <w:r>
+        <w:tab/>
+      </w:r>
+    </w:p>
+    <w:p>
+      <w:pPr>
+        <w:tabs>
+          <w:tab w:val="left" w:leader="dot" w:pos="9270"/>
+        </w:tabs>
+        <w:ind w:firstLine="450"/>
+      </w:pPr>
+      <w:r>
+        <w:tab/>
+      </w:r>
+    </w:p>
+    <w:p>
+      <w:pPr>
+        <w:tabs>
+          <w:tab w:val="left" w:leader="dot" w:pos="9270"/>
+        </w:tabs>
+        <w:ind w:firstLine="450"/>
+      </w:pPr>
+      <w:r>
+        <w:tab/>
+      </w:r>
+    </w:p>
+    <w:p>
+      <w:pPr>
+        <w:tabs>
+          <w:tab w:val="left" w:leader="dot" w:pos="9270"/>
+        </w:tabs>
+        <w:ind w:firstLine="450"/>
+      </w:pPr>
+      <w:r>
+        <w:tab/>
+      </w:r>
+    </w:p>
+    <w:p>
+      <w:pPr>
+        <w:tabs>
+          <w:tab w:val="left" w:leader="dot" w:pos="9270"/>
+        </w:tabs>
+        <w:ind w:firstLine="450"/>
+      </w:pPr>
+      <w:r>
+        <w:tab/>
+      </w:r>
+    </w:p>
+    <w:p>
+      <w:pPr>
+        <w:tabs>
+          <w:tab w:val="left" w:leader="dot" w:pos="9270"/>
+        </w:tabs>
+        <w:ind w:firstLine="450"/>
+      </w:pPr>
+      <w:r>
+        <w:tab/>
+      </w:r>
+    </w:p>
+    <w:p>
+      <w:pPr>
+        <w:tabs>
+          <w:tab w:val="left" w:leader="dot" w:pos="9270"/>
+        </w:tabs>
+        <w:ind w:firstLine="450"/>
+      </w:pPr>
+      <w:r>
+        <w:tab/>
+      </w:r>
+    </w:p>
+    <w:p>
+      <w:pPr>
+        <w:tabs>
+          <w:tab w:val="left" w:leader="dot" w:pos="9270"/>
+        </w:tabs>
+        <w:ind w:firstLine="450"/>
+      </w:pPr>
+      <w:r>
+        <w:tab/>
+      </w:r>
+    </w:p>
+    <w:p>
+      <w:pPr>
+        <w:tabs>
+          <w:tab w:val="left" w:leader="dot" w:pos="9270"/>
+        </w:tabs>
+        <w:ind w:firstLine="450"/>
+      </w:pPr>
+      <w:r>
+        <w:tab/>
+      </w:r>
+    </w:p>
+    <w:p>
+      <w:pPr>
+        <w:tabs>
+          <w:tab w:val="left" w:leader="dot" w:pos="9270"/>
+        </w:tabs>
+        <w:ind w:firstLine="450"/>
+      </w:pPr>
+      <w:r>
+        <w:tab/>
+      </w:r>
+    </w:p>
+    <w:p>
+      <w:pPr>
+        <w:tabs>
+          <w:tab w:val="left" w:leader="dot" w:pos="9270"/>
+        </w:tabs>
+        <w:ind w:firstLine="450"/>
+      </w:pPr>
+      <w:r>
+        <w:tab/>
+      </w:r>
+    </w:p>
+    <w:p>
+      <w:pPr>
+        <w:tabs>
+          <w:tab w:val="left" w:leader="dot" w:pos="9270"/>
+        </w:tabs>
+        <w:ind w:firstLine="450"/>
+      </w:pPr>
+      <w:r>
+        <w:tab/>
+      </w:r>
+    </w:p>
+    <w:p>
+      <w:pPr>
+        <w:tabs>
+          <w:tab w:val="left" w:leader="dot" w:pos="9270"/>
+        </w:tabs>
+        <w:ind w:firstLine="450"/>
+      </w:pPr>
+      <w:r>
+        <w:tab/>
+      </w:r>
+    </w:p>
+    <w:p>
+      <w:pPr>
+        <w:widowControl w:val="0"/>
+        <w:autoSpaceDE w:val="0"/>
+        <w:autoSpaceDN w:val="0"/>
+        <w:adjustRightInd w:val="0"/>
+        <w:ind w:left="120" w:right="-20"/>
+        <w:rPr>
+          <w:sz w:val="26"/>
+          <w:szCs w:val="26"/>
+        </w:rPr>
+      </w:pPr>
+    </w:p>
+    <w:p>
+      <w:pPr>
+        <w:widowControl w:val="0"/>
+        <w:autoSpaceDE w:val="0"/>
+        <w:autoSpaceDN w:val="0"/>
+        <w:adjustRightInd w:val="0"/>
+        <w:ind w:left="120" w:right="-20"/>
+        <w:rPr>
+          <w:sz w:val="26"/>
+          <w:szCs w:val="26"/>
+        </w:rPr>
+      </w:pPr>
+    </w:p>
+    <w:p>
+      <w:pPr>
+        <w:widowControl w:val="0"/>
+        <w:autoSpaceDE w:val="0"/>
+        <w:autoSpaceDN w:val="0"/>
+        <w:adjustRightInd w:val="0"/>
+        <w:ind w:left="120" w:right="-20"/>
+        <w:rPr>
+          <w:sz w:val="26"/>
+          <w:szCs w:val="26"/>
+        </w:rPr>
+      </w:pPr>
+    </w:p>
+    <w:p>
+      <w:pPr>
+        <w:widowControl w:val="0"/>
+        <w:autoSpaceDE w:val="0"/>
+        <w:autoSpaceDN w:val="0"/>
+        <w:adjustRightInd w:val="0"/>
+        <w:ind w:left="120" w:right="-20" w:firstLine="600"/>
+        <w:rPr>
+          <w:b/>
+          <w:sz w:val="26"/>
+          <w:szCs w:val="26"/>
+        </w:rPr>
+      </w:pPr>
+      <w:r>
+        <w:rPr>
+          <w:b/>
+          <w:sz w:val="26"/>
+          <w:szCs w:val="26"/>
+        </w:rPr>
+        <w:t xml:space="preserve">Điểm lab report: </w:t>
+      </w:r>
+    </w:p>
+    <w:p>
+      <w:pPr>
+        <w:widowControl w:val="0"/>
+        <w:autoSpaceDE w:val="0"/>
+        <w:autoSpaceDN w:val="0"/>
+        <w:adjustRightInd w:val="0"/>
+        <w:ind w:left="120" w:right="-20"/>
+        <w:rPr>
+          <w:sz w:val="26"/>
+          <w:szCs w:val="26"/>
+        </w:rPr>
+      </w:pPr>
+    </w:p>
+    <w:p>
+      <w:pPr>
+        <w:widowControl w:val="0"/>
+        <w:autoSpaceDE w:val="0"/>
+        <w:autoSpaceDN w:val="0"/>
+        <w:adjustRightInd w:val="0"/>
+        <w:ind w:left="120" w:right="-20"/>
+        <w:rPr>
+          <w:sz w:val="26"/>
+          <w:szCs w:val="26"/>
+        </w:rPr>
+      </w:pPr>
+    </w:p>
+    <w:p>
+      <w:pPr>
+        <w:widowControl w:val="0"/>
+        <w:autoSpaceDE w:val="0"/>
+        <w:autoSpaceDN w:val="0"/>
+        <w:adjustRightInd w:val="0"/>
+        <w:ind w:right="-20"/>
+        <w:rPr>
+          <w:sz w:val="26"/>
+          <w:szCs w:val="26"/>
+        </w:rPr>
+      </w:pPr>
+    </w:p>
+    <w:p>
+      <w:pPr>
+        <w:jc w:val="both"/>
+        <w:rPr>
+          <w:b/>
+          <w:sz w:val="26"/>
+          <w:szCs w:val="26"/>
+        </w:rPr>
+      </w:pPr>
+    </w:p>
+    <w:p>
+      <w:pPr>
+        <w:jc w:val="both"/>
+        <w:rPr>
+          <w:b/>
+          <w:sz w:val="26"/>
+          <w:szCs w:val="26"/>
+        </w:rPr>
+      </w:pPr>
+    </w:p>
+    <w:p>
+      <w:pPr>
+        <w:jc w:val="both"/>
+        <w:rPr>
+          <w:b/>
+          <w:sz w:val="26"/>
+          <w:szCs w:val="26"/>
+        </w:rPr>
+      </w:pPr>
+    </w:p>
+    <w:p>
+      <w:pPr>
+        <w:jc w:val="both"/>
+        <w:rPr>
+          <w:b/>
+          <w:sz w:val="26"/>
+          <w:szCs w:val="26"/>
+        </w:rPr>
+      </w:pPr>
+    </w:p>
+    <w:p>
+      <w:pPr>
+        <w:jc w:val="both"/>
+        <w:rPr>
+          <w:b/>
+          <w:sz w:val="26"/>
+          <w:szCs w:val="26"/>
+        </w:rPr>
+      </w:pPr>
+    </w:p>
+    <w:p>
+      <w:pPr>
+        <w:jc w:val="both"/>
+        <w:rPr>
+          <w:b/>
+          <w:sz w:val="26"/>
+          <w:szCs w:val="26"/>
+        </w:rPr>
+      </w:pPr>
+    </w:p>
+    <w:p>
+      <w:pPr>
+        <w:jc w:val="both"/>
+        <w:rPr>
+          <w:b/>
+          <w:sz w:val="26"/>
+          <w:szCs w:val="26"/>
+        </w:rPr>
+      </w:pPr>
+    </w:p>
+    <w:p>
+      <w:pPr>
+        <w:jc w:val="both"/>
+        <w:rPr>
+          <w:b/>
+          <w:sz w:val="26"/>
+          <w:szCs w:val="26"/>
+        </w:rPr>
+      </w:pPr>
+    </w:p>
+    <w:p>
+      <w:pPr>
+        <w:jc w:val="both"/>
+        <w:rPr>
+          <w:b/>
+          <w:sz w:val="26"/>
+          <w:szCs w:val="26"/>
+        </w:rPr>
+      </w:pPr>
+    </w:p>
+    <w:p>
+      <w:pPr>
+        <w:jc w:val="both"/>
+        <w:rPr>
+          <w:b/>
+          <w:sz w:val="26"/>
+          <w:szCs w:val="26"/>
+        </w:rPr>
+      </w:pPr>
+    </w:p>
+    <w:p>
+      <w:pPr>
+        <w:jc w:val="both"/>
+        <w:rPr>
+          <w:b/>
+          <w:sz w:val="26"/>
+          <w:szCs w:val="26"/>
+        </w:rPr>
+      </w:pPr>
+    </w:p>
+    <w:p>
+      <w:pPr>
+        <w:jc w:val="center"/>
+        <w:rPr>
+          <w:b/>
+          <w:sz w:val="26"/>
+          <w:szCs w:val="26"/>
+        </w:rPr>
+      </w:pPr>
+      <w:r>
+        <w:rPr>
+          <w:b/>
+          <w:sz w:val="26"/>
+          <w:szCs w:val="26"/>
+        </w:rPr>
+        <w:t xml:space="preserve">PHẦN BÀI LÀM </w:t>
+      </w:r>
+    </w:p>
+    <w:p>
+      <w:pPr>
+        <w:spacing w:before="120" w:after="80" w:line="324" w:lineRule="auto"/>
+        <w:rPr>
+          <w:b/>
+          <w:sz w:val="26"/>
+          <w:szCs w:val="26"/>
+          <w:lang w:val="vi-VN"/>
+        </w:rPr>
+      </w:pPr>
+      <w:r>
+        <w:rPr>
+          <w:b/>
+          <w:sz w:val="26"/>
+          <w:szCs w:val="26"/>
+          <w:lang w:val="vi-VN"/>
+        </w:rPr>
+        <w:t xml:space="preserve">Link GitHub cá nhân chứa source code: </w:t>
+      </w:r>
+      <w:hyperlink r:id="rId11" w:history="1">
+        <w:r>
+          <w:rPr>
+            <w:rStyle w:val="Hyperlink"/>
+            <w:b/>
+            <w:color w:val="0563C1"/>
+            <w:u w:val="single"/>
+            <w:sz w:val="26"/>
+            <w:szCs w:val="26"/>
+          </w:rPr>
+          <w:t>https://github.com/Cal-105/ptthth_21bvl_25765261</w:t>
+        </w:r>
+      </w:hyperlink>
+    </w:p>
+    <w:p>
       <w:pPr>
         <w:spacing w:before="240" w:after="80"/>
         <w:rPr>
@@ -43,7 +1299,8 @@
         </w:rPr>
         <w:t>A. CÁC VÍ DỤ THỰC HÀNH CÓ HƯỚNG DẪN</w:t>
       </w:r>
-    </w:p><w:p>
+    </w:p>
+    <w:p>
       <w:pPr>
         <w:spacing w:before="160" w:after="80"/>
         <w:rPr>
@@ -64,70 +1321,64 @@
         </w:rPr>
         <w:t>1. Ví dụ 4.1: Khảo sát địa chỉ mạng (HostInspector.java)</w:t>
       </w:r>
-    </w:p><w:p>
+    </w:p>
+    <w:p>
       <w:pPr>
         <w:spacing w:before="60" w:after="60" w:line="280" w:lineRule="auto"/>
         <w:rPr>
-          
-          
-          <w:sz w:val="24"/>
-          <w:szCs w:val="24"/>
-          <w:lang w:val="vi-VN"/>
-        </w:rPr>
-      </w:pPr>
-      <w:r>
-        <w:rPr>
-          
-          
+          <w:sz w:val="24"/>
+          <w:szCs w:val="24"/>
+          <w:lang w:val="vi-VN"/>
+        </w:rPr>
+      </w:pPr>
+      <w:r>
+        <w:rPr>
           <w:sz w:val="24"/>
           <w:szCs w:val="24"/>
           <w:lang w:val="vi-VN"/>
         </w:rPr>
         <w:t xml:space="preserve">• Mục tiêu: Phân giải hostname thành địa chỉ IP bằng InetAddress, lấy Canonical Hostname, nhận diện Loopback, Site Local và phân loại rõ ràng IPv4 / IPv6.</w:t>
       </w:r>
-    </w:p><w:p>
+    </w:p>
+    <w:p>
       <w:pPr>
         <w:spacing w:before="60" w:after="60" w:line="280" w:lineRule="auto"/>
         <w:rPr>
-          
-          
-          <w:sz w:val="24"/>
-          <w:szCs w:val="24"/>
-          <w:lang w:val="vi-VN"/>
-        </w:rPr>
-      </w:pPr>
-      <w:r>
-        <w:rPr>
-          
-          
+          <w:sz w:val="24"/>
+          <w:szCs w:val="24"/>
+          <w:lang w:val="vi-VN"/>
+        </w:rPr>
+      </w:pPr>
+      <w:r>
+        <w:rPr>
           <w:sz w:val="24"/>
           <w:szCs w:val="24"/>
           <w:lang w:val="vi-VN"/>
         </w:rPr>
         <w:t xml:space="preserve">• Thử nghiệm với: localhost, example.com, và trường hợp host không tồn tại (host-khong-ton-tai.invalid).</w:t>
       </w:r>
-    </w:p><w:p>
+    </w:p>
+    <w:p>
       <w:pPr>
         <w:spacing w:before="60" w:after="60" w:line="280" w:lineRule="auto"/>
         <w:rPr>
           <w:b/>
-          
-          <w:sz w:val="24"/>
-          <w:szCs w:val="24"/>
-          <w:lang w:val="vi-VN"/>
-        </w:rPr>
-      </w:pPr>
-      <w:r>
-        <w:rPr>
-          <w:b/>
-          
+          <w:sz w:val="24"/>
+          <w:szCs w:val="24"/>
+          <w:lang w:val="vi-VN"/>
+        </w:rPr>
+      </w:pPr>
+      <w:r>
+        <w:rPr>
+          <w:b/>
           <w:sz w:val="24"/>
           <w:szCs w:val="24"/>
           <w:lang w:val="vi-VN"/>
         </w:rPr>
         <w:t xml:space="preserve">• Hình ảnh toàn màn hình VS Code (mã nguồn + Terminal thực thi + Taskbar Desktop hiển thị thời gian hệ thống):</w:t>
       </w:r>
-    </w:p><w:p>
+    </w:p>
+    <w:p>
       <w:pPr>
         <w:spacing w:before="120" w:after="160"/>
         <w:jc w:val="center"/>
@@ -150,14 +1401,18 @@
                   </pic:nvPicPr>
                   <pic:blipFill>
                     <a:blip r:embed="rId21"/>
-                    <a:stretch><a:fillRect/></a:stretch>
+                    <a:stretch>
+                      <a:fillRect/>
+                    </a:stretch>
                   </pic:blipFill>
                   <pic:spPr>
                     <a:xfrm>
                       <a:off x="0" y="0"/>
                       <a:ext cx="6400800" cy="3599815"/>
                     </a:xfrm>
-                    <a:prstGeom prst="rect"><a:avLst/></a:prstGeom>
+                    <a:prstGeom prst="rect">
+                      <a:avLst/>
+                    </a:prstGeom>
                   </pic:spPr>
                 </pic:pic>
               </a:graphicData>
@@ -165,7 +1420,8 @@
           </wp:inline>
         </w:drawing>
       </w:r>
-    </w:p><w:p>
+    </w:p>
+    <w:p>
       <w:pPr>
         <w:spacing w:before="160" w:after="80"/>
         <w:rPr>
@@ -184,72 +1440,66 @@
           <w:szCs w:val="26"/>
           <w:lang w:val="vi-VN"/>
         </w:rPr>
-        <w:t>2. Ví dụ 4.2: TCP Command Server & Client (TcpCommandServer.java & TcpCommandClient.java)</w:t>
-      </w:r>
-    </w:p><w:p>
+        <w:t>2. Ví dụ 4.2: TCP Command Server &amp; Client (TcpCommandServer.java &amp; TcpCommandClient.java)</w:t>
+      </w:r>
+    </w:p>
+    <w:p>
       <w:pPr>
         <w:spacing w:before="60" w:after="60" w:line="280" w:lineRule="auto"/>
         <w:rPr>
-          
-          
-          <w:sz w:val="24"/>
-          <w:szCs w:val="24"/>
-          <w:lang w:val="vi-VN"/>
-        </w:rPr>
-      </w:pPr>
-      <w:r>
-        <w:rPr>
-          
-          
+          <w:sz w:val="24"/>
+          <w:szCs w:val="24"/>
+          <w:lang w:val="vi-VN"/>
+        </w:rPr>
+      </w:pPr>
+      <w:r>
+        <w:rPr>
           <w:sz w:val="24"/>
           <w:szCs w:val="24"/>
           <w:lang w:val="vi-VN"/>
         </w:rPr>
         <w:t xml:space="preserve">• Mục tiêu: Xây dựng client - server theo giao thức dòng ký tự kết thúc bằng xuống dòng trên kết nối TCP (cổng 5000), mã hóa UTF-8, sử dụng try-with-resources.</w:t>
       </w:r>
-    </w:p><w:p>
+    </w:p>
+    <w:p>
       <w:pPr>
         <w:spacing w:before="60" w:after="60" w:line="280" w:lineRule="auto"/>
         <w:rPr>
-          
-          
-          <w:sz w:val="24"/>
-          <w:szCs w:val="24"/>
-          <w:lang w:val="vi-VN"/>
-        </w:rPr>
-      </w:pPr>
-      <w:r>
-        <w:rPr>
-          
-          
-          <w:sz w:val="24"/>
-          <w:szCs w:val="24"/>
-          <w:lang w:val="vi-VN"/>
-        </w:rPr>
-        <w:t xml:space="preserve">• Kiểm thử các lệnh: PING -> OK PONG, UPPER text -> OK TEXT, TIME -> OK ISO_DATETIME, QUIT -> OK BYE, lệnh không xác định -> ERR UNKNOWN_COMMAND.</w:t>
-      </w:r>
-    </w:p><w:p>
+          <w:sz w:val="24"/>
+          <w:szCs w:val="24"/>
+          <w:lang w:val="vi-VN"/>
+        </w:rPr>
+      </w:pPr>
+      <w:r>
+        <w:rPr>
+          <w:sz w:val="24"/>
+          <w:szCs w:val="24"/>
+          <w:lang w:val="vi-VN"/>
+        </w:rPr>
+        <w:t xml:space="preserve">• Kiểm thử các lệnh: PING -&gt; OK PONG, UPPER text -&gt; OK TEXT, TIME -&gt; OK ISO_DATETIME, QUIT -&gt; OK BYE, lệnh không xác định -&gt; ERR UNKNOWN_COMMAND.</w:t>
+      </w:r>
+    </w:p>
+    <w:p>
       <w:pPr>
         <w:spacing w:before="60" w:after="60" w:line="280" w:lineRule="auto"/>
         <w:rPr>
           <w:b/>
-          
-          <w:sz w:val="24"/>
-          <w:szCs w:val="24"/>
-          <w:lang w:val="vi-VN"/>
-        </w:rPr>
-      </w:pPr>
-      <w:r>
-        <w:rPr>
-          <w:b/>
-          
+          <w:sz w:val="24"/>
+          <w:szCs w:val="24"/>
+          <w:lang w:val="vi-VN"/>
+        </w:rPr>
+      </w:pPr>
+      <w:r>
+        <w:rPr>
+          <w:b/>
           <w:sz w:val="24"/>
           <w:szCs w:val="24"/>
           <w:lang w:val="vi-VN"/>
         </w:rPr>
         <w:t xml:space="preserve">• Hình ảnh toàn màn hình VS Code (mã nguồn + Terminal thực thi trao đổi Client - Server + Taskbar Desktop hiển thị thời gian hệ thống):</w:t>
       </w:r>
-    </w:p><w:p>
+    </w:p>
+    <w:p>
       <w:pPr>
         <w:spacing w:before="120" w:after="160"/>
         <w:jc w:val="center"/>
@@ -272,14 +1522,18 @@
                   </pic:nvPicPr>
                   <pic:blipFill>
                     <a:blip r:embed="rId22"/>
-                    <a:stretch><a:fillRect/></a:stretch>
+                    <a:stretch>
+                      <a:fillRect/>
+                    </a:stretch>
                   </pic:blipFill>
                   <pic:spPr>
                     <a:xfrm>
                       <a:off x="0" y="0"/>
                       <a:ext cx="6400800" cy="3599815"/>
                     </a:xfrm>
-                    <a:prstGeom prst="rect"><a:avLst/></a:prstGeom>
+                    <a:prstGeom prst="rect">
+                      <a:avLst/>
+                    </a:prstGeom>
                   </pic:spPr>
                 </pic:pic>
               </a:graphicData>
@@ -287,7 +1541,8 @@
           </wp:inline>
         </w:drawing>
       </w:r>
-    </w:p><w:p>
+    </w:p>
+    <w:p>
       <w:pPr>
         <w:spacing w:before="240" w:after="80"/>
         <w:rPr>
@@ -308,7 +1563,8 @@
         </w:rPr>
         <w:t>B. CÁC BÀI TẬP ĐỀ XUẤT</w:t>
       </w:r>
-    </w:p><w:p>
+    </w:p>
+    <w:p>
       <w:pPr>
         <w:spacing w:before="160" w:after="80"/>
         <w:rPr>
@@ -329,70 +1585,64 @@
         </w:rPr>
         <w:t>1. Bài tập 1: Host và URI Inspector (HostAndUriInspector.java)</w:t>
       </w:r>
-    </w:p><w:p>
+    </w:p>
+    <w:p>
       <w:pPr>
         <w:spacing w:before="60" w:after="60" w:line="280" w:lineRule="auto"/>
         <w:rPr>
-          
-          
-          <w:sz w:val="24"/>
-          <w:szCs w:val="24"/>
-          <w:lang w:val="vi-VN"/>
-        </w:rPr>
-      </w:pPr>
-      <w:r>
-        <w:rPr>
-          
-          
+          <w:sz w:val="24"/>
+          <w:szCs w:val="24"/>
+          <w:lang w:val="vi-VN"/>
+        </w:rPr>
+      </w:pPr>
+      <w:r>
+        <w:rPr>
           <w:sz w:val="24"/>
           <w:szCs w:val="24"/>
           <w:lang w:val="vi-VN"/>
         </w:rPr>
         <w:t xml:space="preserve">• Mục tiêu: Nhận hostname và URI qua tham số dòng lệnh (args); phân giải toàn bộ IP, phân loại IPv4/IPv6, loopback, site local; phân tích các thành phần URI (scheme, host, port, path, query, fragment) bằng java.net.URI.</w:t>
       </w:r>
-    </w:p><w:p>
+    </w:p>
+    <w:p>
       <w:pPr>
         <w:spacing w:before="60" w:after="60" w:line="280" w:lineRule="auto"/>
         <w:rPr>
-          
-          
-          <w:sz w:val="24"/>
-          <w:szCs w:val="24"/>
-          <w:lang w:val="vi-VN"/>
-        </w:rPr>
-      </w:pPr>
-      <w:r>
-        <w:rPr>
-          
-          
+          <w:sz w:val="24"/>
+          <w:szCs w:val="24"/>
+          <w:lang w:val="vi-VN"/>
+        </w:rPr>
+      </w:pPr>
+      <w:r>
+        <w:rPr>
           <w:sz w:val="24"/>
           <w:szCs w:val="24"/>
           <w:lang w:val="vi-VN"/>
         </w:rPr>
         <w:t xml:space="preserve">• Minh chứng: Thực hiện đầy đủ 3 ca hợp lệ (localhost, example.com, google.com) và 3 ca lỗi (thiếu tham số, hostname không phân giải được, URI sai cú pháp).</w:t>
       </w:r>
-    </w:p><w:p>
+    </w:p>
+    <w:p>
       <w:pPr>
         <w:spacing w:before="60" w:after="60" w:line="280" w:lineRule="auto"/>
         <w:rPr>
           <w:b/>
-          
-          <w:sz w:val="24"/>
-          <w:szCs w:val="24"/>
-          <w:lang w:val="vi-VN"/>
-        </w:rPr>
-      </w:pPr>
-      <w:r>
-        <w:rPr>
-          <w:b/>
-          
+          <w:sz w:val="24"/>
+          <w:szCs w:val="24"/>
+          <w:lang w:val="vi-VN"/>
+        </w:rPr>
+      </w:pPr>
+      <w:r>
+        <w:rPr>
+          <w:b/>
           <w:sz w:val="24"/>
           <w:szCs w:val="24"/>
           <w:lang w:val="vi-VN"/>
         </w:rPr>
         <w:t xml:space="preserve">• Hình ảnh toàn màn hình VS Code (mã nguồn + Terminal thực thi các ca kiểm thử + Taskbar Desktop hiển thị thời gian hệ thống):</w:t>
       </w:r>
-    </w:p><w:p>
+    </w:p>
+    <w:p>
       <w:pPr>
         <w:spacing w:before="120" w:after="160"/>
         <w:jc w:val="center"/>
@@ -415,14 +1665,18 @@
                   </pic:nvPicPr>
                   <pic:blipFill>
                     <a:blip r:embed="rId23"/>
-                    <a:stretch><a:fillRect/></a:stretch>
+                    <a:stretch>
+                      <a:fillRect/>
+                    </a:stretch>
                   </pic:blipFill>
                   <pic:spPr>
                     <a:xfrm>
                       <a:off x="0" y="0"/>
                       <a:ext cx="6400800" cy="3599815"/>
                     </a:xfrm>
-                    <a:prstGeom prst="rect"><a:avLst/></a:prstGeom>
+                    <a:prstGeom prst="rect">
+                      <a:avLst/>
+                    </a:prstGeom>
                   </pic:spPr>
                 </pic:pic>
               </a:graphicData>
@@ -430,7 +1684,8 @@
           </wp:inline>
         </w:drawing>
       </w:r>
-    </w:p><w:p>
+    </w:p>
+    <w:p>
       <w:pPr>
         <w:spacing w:before="160" w:after="80"/>
         <w:rPr>
@@ -449,72 +1704,66 @@
           <w:szCs w:val="26"/>
           <w:lang w:val="vi-VN"/>
         </w:rPr>
-        <w:t>2. Bài tập 2: TCP Server đổi chữ số thành chữ tiếng Việt (DigitToWordServer.java & DigitToWordClient.java)</w:t>
-      </w:r>
-    </w:p><w:p>
+        <w:t>2. Bài tập 2: TCP Server đổi chữ số thành chữ tiếng Việt (DigitToWordServer.java &amp; DigitToWordClient.java)</w:t>
+      </w:r>
+    </w:p>
+    <w:p>
       <w:pPr>
         <w:spacing w:before="60" w:after="60" w:line="280" w:lineRule="auto"/>
         <w:rPr>
-          
-          
-          <w:sz w:val="24"/>
-          <w:szCs w:val="24"/>
-          <w:lang w:val="vi-VN"/>
-        </w:rPr>
-      </w:pPr>
-      <w:r>
-        <w:rPr>
-          
-          
+          <w:sz w:val="24"/>
+          <w:szCs w:val="24"/>
+          <w:lang w:val="vi-VN"/>
+        </w:rPr>
+      </w:pPr>
+      <w:r>
+        <w:rPr>
           <w:sz w:val="24"/>
           <w:szCs w:val="24"/>
           <w:lang w:val="vi-VN"/>
         </w:rPr>
         <w:t xml:space="preserve">• Mục tiêu: Giao thức dòng qua TCP trên cổng 5002, phục vụ đa client đồng thời qua Thread Pool. Client gửi một ký tự từ 0 đến 9, server trả về cách đọc tiếng Việt tương ứng.</w:t>
       </w:r>
-    </w:p><w:p>
+    </w:p>
+    <w:p>
       <w:pPr>
         <w:spacing w:before="60" w:after="60" w:line="280" w:lineRule="auto"/>
         <w:rPr>
-          
-          
-          <w:sz w:val="24"/>
-          <w:szCs w:val="24"/>
-          <w:lang w:val="vi-VN"/>
-        </w:rPr>
-      </w:pPr>
-      <w:r>
-        <w:rPr>
-          
-          
+          <w:sz w:val="24"/>
+          <w:szCs w:val="24"/>
+          <w:lang w:val="vi-VN"/>
+        </w:rPr>
+      </w:pPr>
+      <w:r>
+        <w:rPr>
           <w:sz w:val="24"/>
           <w:szCs w:val="24"/>
           <w:lang w:val="vi-VN"/>
         </w:rPr>
         <w:t xml:space="preserve">• Kiểm thử nghiêm ngặt các ca biên bắt buộc: 0 (không), 9 (chín), chuỗi rỗng "", 10, ký tự 'a', dữ liệu có khoảng trắng " 5 " đều trả về ERR INVALID_DIGIT; lệnh QUIT phản hồi OK BYE và đóng kết nối.</w:t>
       </w:r>
-    </w:p><w:p>
+    </w:p>
+    <w:p>
       <w:pPr>
         <w:spacing w:before="60" w:after="60" w:line="280" w:lineRule="auto"/>
         <w:rPr>
           <w:b/>
-          
-          <w:sz w:val="24"/>
-          <w:szCs w:val="24"/>
-          <w:lang w:val="vi-VN"/>
-        </w:rPr>
-      </w:pPr>
-      <w:r>
-        <w:rPr>
-          <w:b/>
-          
+          <w:sz w:val="24"/>
+          <w:szCs w:val="24"/>
+          <w:lang w:val="vi-VN"/>
+        </w:rPr>
+      </w:pPr>
+      <w:r>
+        <w:rPr>
+          <w:b/>
           <w:sz w:val="24"/>
           <w:szCs w:val="24"/>
           <w:lang w:val="vi-VN"/>
         </w:rPr>
         <w:t xml:space="preserve">• Hình ảnh toàn màn hình VS Code (mã nguồn + Terminal thực thi kiểm thử các ca biên + Taskbar Desktop hiển thị thời gian hệ thống):</w:t>
       </w:r>
-    </w:p><w:p>
+    </w:p>
+    <w:p>
       <w:pPr>
         <w:spacing w:before="120" w:after="160"/>
         <w:jc w:val="center"/>
@@ -537,14 +1786,18 @@
                   </pic:nvPicPr>
                   <pic:blipFill>
                     <a:blip r:embed="rId24"/>
-                    <a:stretch><a:fillRect/></a:stretch>
+                    <a:stretch>
+                      <a:fillRect/>
+                    </a:stretch>
                   </pic:blipFill>
                   <pic:spPr>
                     <a:xfrm>
                       <a:off x="0" y="0"/>
                       <a:ext cx="6400800" cy="3599815"/>
                     </a:xfrm>
-                    <a:prstGeom prst="rect"><a:avLst/></a:prstGeom>
+                    <a:prstGeom prst="rect">
+                      <a:avLst/>
+                    </a:prstGeom>
                   </pic:spPr>
                 </pic:pic>
               </a:graphicData>
@@ -552,7 +1805,8 @@
           </wp:inline>
         </w:drawing>
       </w:r>
-    </w:p><w:p>
+    </w:p>
+    <w:p>
       <w:pPr>
         <w:spacing w:before="160" w:after="80"/>
         <w:rPr>
@@ -571,114 +1825,104 @@
           <w:szCs w:val="26"/>
           <w:lang w:val="vi-VN"/>
         </w:rPr>
-        <w:t>3. Bài tập 3: Dịch vụ ngày giờ TCP và UDP (DateTimeTcp & DateTimeUdp)</w:t>
-      </w:r>
-    </w:p><w:p>
+        <w:t>3. Bài tập 3: Dịch vụ ngày giờ TCP và UDP (DateTimeTcp &amp; DateTimeUdp)</w:t>
+      </w:r>
+    </w:p>
+    <w:p>
       <w:pPr>
         <w:spacing w:before="60" w:after="60" w:line="280" w:lineRule="auto"/>
         <w:rPr>
-          
-          
-          <w:sz w:val="24"/>
-          <w:szCs w:val="24"/>
-          <w:lang w:val="vi-VN"/>
-        </w:rPr>
-      </w:pPr>
-      <w:r>
-        <w:rPr>
-          
-          
+          <w:sz w:val="24"/>
+          <w:szCs w:val="24"/>
+          <w:lang w:val="vi-VN"/>
+        </w:rPr>
+      </w:pPr>
+      <w:r>
+        <w:rPr>
           <w:sz w:val="24"/>
           <w:szCs w:val="24"/>
           <w:lang w:val="vi-VN"/>
         </w:rPr>
         <w:t xml:space="preserve">• Mục tiêu: Xây dựng dịch vụ cung cấp ngày giờ trên cả hai giao thức TCP (cổng 5003) và UDP (cổng 5004). Hỗ trợ các lệnh: DATE, TIME, DATETIME sử dụng DateTimeFormatter định dạng dd/MM/yyyy và HH:mm:ss.</w:t>
       </w:r>
-    </w:p><w:p>
+    </w:p>
+    <w:p>
       <w:pPr>
         <w:spacing w:before="60" w:after="60" w:line="280" w:lineRule="auto"/>
         <w:rPr>
           <w:b/>
-          
-          <w:sz w:val="24"/>
-          <w:szCs w:val="24"/>
-          <w:lang w:val="vi-VN"/>
-        </w:rPr>
-      </w:pPr>
-      <w:r>
-        <w:rPr>
-          <w:b/>
-          
+          <w:sz w:val="24"/>
+          <w:szCs w:val="24"/>
+          <w:lang w:val="vi-VN"/>
+        </w:rPr>
+      </w:pPr>
+      <w:r>
+        <w:rPr>
+          <w:b/>
           <w:sz w:val="24"/>
           <w:szCs w:val="24"/>
           <w:lang w:val="vi-VN"/>
         </w:rPr>
         <w:t xml:space="preserve">• So sánh chi tiết hành vi khi Server dừng đột ngột giữa lúc Client đang hoạt động:</w:t>
       </w:r>
-    </w:p><w:p>
+    </w:p>
+    <w:p>
       <w:pPr>
         <w:spacing w:before="60" w:after="60" w:line="280" w:lineRule="auto"/>
         <w:rPr>
-          
-          
-          <w:sz w:val="24"/>
-          <w:szCs w:val="24"/>
-          <w:lang w:val="vi-VN"/>
-        </w:rPr>
-      </w:pPr>
-      <w:r>
-        <w:rPr>
-          
-          
+          <w:sz w:val="24"/>
+          <w:szCs w:val="24"/>
+          <w:lang w:val="vi-VN"/>
+        </w:rPr>
+      </w:pPr>
+      <w:r>
+        <w:rPr>
           <w:sz w:val="24"/>
           <w:szCs w:val="24"/>
           <w:lang w:val="vi-VN"/>
         </w:rPr>
         <w:t xml:space="preserve">  + Đối với TCP: Do TCP là giao thức hướng kết nối (connection-oriented) có phiên bắt tay và duy trì trạng thái kết nối. Khi Server dừng hoặc tắt tiến trình, TCP stack của Server gửi gói RST/FIN để đóng socket. TCP Client nhận diện trạng thái mất kết nối lập tức: lệnh readLine() trả về null hoặc ném ngoại lệ SocketException: Connection reset, Client xử lý ngắt kết nối an toàn ngay.</w:t>
       </w:r>
-    </w:p><w:p>
+    </w:p>
+    <w:p>
       <w:pPr>
         <w:spacing w:before="60" w:after="60" w:line="280" w:lineRule="auto"/>
         <w:rPr>
-          
-          
-          <w:sz w:val="24"/>
-          <w:szCs w:val="24"/>
-          <w:lang w:val="vi-VN"/>
-        </w:rPr>
-      </w:pPr>
-      <w:r>
-        <w:rPr>
-          
-          
+          <w:sz w:val="24"/>
+          <w:szCs w:val="24"/>
+          <w:lang w:val="vi-VN"/>
+        </w:rPr>
+      </w:pPr>
+      <w:r>
+        <w:rPr>
           <w:sz w:val="24"/>
           <w:szCs w:val="24"/>
           <w:lang w:val="vi-VN"/>
         </w:rPr>
         <w:t xml:space="preserve">  + Đối với UDP: Do UDP là giao thức phi kết nối (connectionless), không duy trì phiên làm việc. Khi Server dừng, Client không có kênh báo hiệu để biết Server đã chết. Khi Client gửi datagram đi, gói tin sẽ bị mất (drop) hoặc bị mạng loại bỏ. Nếu không có cơ chế timeout, Client sẽ bị treo vô hạn ở hàm socket.receive(). Bằng cách thiết lập socket.setSoTimeout(3000), Client sẽ ném ngoại lệ SocketTimeoutException sau 3 giây chờ, thông báo cho người dùng biết server không phản hồi và thoát hoặc thử lại.</w:t>
       </w:r>
-    </w:p><w:p>
+    </w:p>
+    <w:p>
       <w:pPr>
         <w:spacing w:before="60" w:after="60" w:line="280" w:lineRule="auto"/>
         <w:rPr>
           <w:b/>
-          
-          <w:sz w:val="24"/>
-          <w:szCs w:val="24"/>
-          <w:lang w:val="vi-VN"/>
-        </w:rPr>
-      </w:pPr>
-      <w:r>
-        <w:rPr>
-          <w:b/>
-          
+          <w:sz w:val="24"/>
+          <w:szCs w:val="24"/>
+          <w:lang w:val="vi-VN"/>
+        </w:rPr>
+      </w:pPr>
+      <w:r>
+        <w:rPr>
+          <w:b/>
           <w:sz w:val="24"/>
           <w:szCs w:val="24"/>
           <w:lang w:val="vi-VN"/>
         </w:rPr>
         <w:t xml:space="preserve">• Hình ảnh toàn màn hình VS Code (mã nguồn + Terminal kiểm thử cả TCP và UDP + Taskbar Desktop hiển thị thời gian hệ thống):</w:t>
       </w:r>
-    </w:p><w:p>
+    </w:p>
+    <w:p>
       <w:pPr>
         <w:spacing w:before="120" w:after="160"/>
         <w:jc w:val="center"/>
@@ -701,14 +1945,18 @@
                   </pic:nvPicPr>
                   <pic:blipFill>
                     <a:blip r:embed="rId25"/>
-                    <a:stretch><a:fillRect/></a:stretch>
+                    <a:stretch>
+                      <a:fillRect/>
+                    </a:stretch>
                   </pic:blipFill>
                   <pic:spPr>
                     <a:xfrm>
                       <a:off x="0" y="0"/>
                       <a:ext cx="6400800" cy="3599815"/>
                     </a:xfrm>
-                    <a:prstGeom prst="rect"><a:avLst/></a:prstGeom>
+                    <a:prstGeom prst="rect">
+                      <a:avLst/>
+                    </a:prstGeom>
                   </pic:spPr>
                 </pic:pic>
               </a:graphicData>
@@ -716,15 +1964,17 @@
           </wp:inline>
         </w:drawing>
       </w:r>
-    </w:p><w:sectPr>
-  <w:headerReference w:type="default" r:id="rId15"/>
-  <w:footerReference w:type="default" r:id="rId16"/>
-  <w:pgSz w:w="12240" w:h="15840"/>
-  <w:pgMar w:top="1152" w:right="720" w:bottom="1152" w:left="1440" w:header="720" w:footer="720" w:gutter="0"/>
-  <w:cols w:space="720"/>
-  <w:docGrid w:linePitch="360"/>
-</w:sectPr>
-</w:body></w:document>
+    </w:p>
+    <w:sectPr>
+      <w:headerReference w:type="default" r:id="rId15"/>
+      <w:footerReference w:type="default" r:id="rId16"/>
+      <w:pgSz w:w="12240" w:h="15840"/>
+      <w:pgMar w:top="1152" w:right="720" w:bottom="1152" w:left="1440" w:header="720" w:footer="720" w:gutter="0"/>
+      <w:cols w:space="720"/>
+      <w:docGrid w:linePitch="360"/>
+    </w:sectPr>
+  </w:body>
+</w:document>
 </file>
 
 <file path=word/endnotes.xml><?xml version="1.0" encoding="utf-8"?>

</xml_diff>

<commit_message>
docs(lab4): update lab_04.docx and 1080p screenshots for all proposed exercises 1 to 10
</commit_message>
<xml_diff>
--- a/Lab_4/lab_04.docx
+++ b/Lab_4/lab_04.docx
@@ -1324,43 +1324,43 @@
     </w:p>
     <w:p>
       <w:pPr>
-        <w:spacing w:before="60" w:after="60" w:line="280" w:lineRule="auto"/>
-        <w:rPr>
-          <w:sz w:val="24"/>
-          <w:szCs w:val="24"/>
-          <w:lang w:val="vi-VN"/>
-        </w:rPr>
-      </w:pPr>
-      <w:r>
-        <w:rPr>
-          <w:sz w:val="24"/>
-          <w:szCs w:val="24"/>
-          <w:lang w:val="vi-VN"/>
-        </w:rPr>
-        <w:t xml:space="preserve">• Mục tiêu: Phân giải hostname thành địa chỉ IP bằng InetAddress, lấy Canonical Hostname, nhận diện Loopback, Site Local và phân loại rõ ràng IPv4 / IPv6.</w:t>
-      </w:r>
-    </w:p>
-    <w:p>
-      <w:pPr>
-        <w:spacing w:before="60" w:after="60" w:line="280" w:lineRule="auto"/>
-        <w:rPr>
-          <w:sz w:val="24"/>
-          <w:szCs w:val="24"/>
-          <w:lang w:val="vi-VN"/>
-        </w:rPr>
-      </w:pPr>
-      <w:r>
-        <w:rPr>
-          <w:sz w:val="24"/>
-          <w:szCs w:val="24"/>
-          <w:lang w:val="vi-VN"/>
-        </w:rPr>
-        <w:t xml:space="preserve">• Thử nghiệm với: localhost, example.com, và trường hợp host không tồn tại (host-khong-ton-tai.invalid).</w:t>
-      </w:r>
-    </w:p>
-    <w:p>
-      <w:pPr>
-        <w:spacing w:before="60" w:after="60" w:line="280" w:lineRule="auto"/>
+        <w:spacing w:before="40" w:after="40" w:line="280" w:lineRule="auto"/>
+        <w:rPr>
+          <w:sz w:val="24"/>
+          <w:szCs w:val="24"/>
+          <w:lang w:val="vi-VN"/>
+        </w:rPr>
+      </w:pPr>
+      <w:r>
+        <w:rPr>
+          <w:sz w:val="24"/>
+          <w:szCs w:val="24"/>
+          <w:lang w:val="vi-VN"/>
+        </w:rPr>
+        <w:t xml:space="preserve">• Mục tiêu: Sử dụng InetAddress để phân giải hostname thành địa chỉ IP, nhận diện Canonical Host Name, kiểm tra Loopback, Site Local và phân biệt rõ ràng IPv4 / IPv6.</w:t>
+      </w:r>
+    </w:p>
+    <w:p>
+      <w:pPr>
+        <w:spacing w:before="40" w:after="40" w:line="280" w:lineRule="auto"/>
+        <w:rPr>
+          <w:sz w:val="24"/>
+          <w:szCs w:val="24"/>
+          <w:lang w:val="vi-VN"/>
+        </w:rPr>
+      </w:pPr>
+      <w:r>
+        <w:rPr>
+          <w:sz w:val="24"/>
+          <w:szCs w:val="24"/>
+          <w:lang w:val="vi-VN"/>
+        </w:rPr>
+        <w:t xml:space="preserve">• Thử nghiệm với các ca: localhost, example.com, và host không tồn tại (host-khong-ton-tai.invalid).</w:t>
+      </w:r>
+    </w:p>
+    <w:p>
+      <w:pPr>
+        <w:spacing w:before="40" w:after="40" w:line="280" w:lineRule="auto"/>
         <w:rPr>
           <w:b/>
           <w:sz w:val="24"/>
@@ -1380,7 +1380,7 @@
     </w:p>
     <w:p>
       <w:pPr>
-        <w:spacing w:before="120" w:after="160"/>
+        <w:spacing w:before="100" w:after="160"/>
         <w:jc w:val="center"/>
       </w:pPr>
       <w:r>
@@ -1445,25 +1445,25 @@
     </w:p>
     <w:p>
       <w:pPr>
-        <w:spacing w:before="60" w:after="60" w:line="280" w:lineRule="auto"/>
-        <w:rPr>
-          <w:sz w:val="24"/>
-          <w:szCs w:val="24"/>
-          <w:lang w:val="vi-VN"/>
-        </w:rPr>
-      </w:pPr>
-      <w:r>
-        <w:rPr>
-          <w:sz w:val="24"/>
-          <w:szCs w:val="24"/>
-          <w:lang w:val="vi-VN"/>
-        </w:rPr>
-        <w:t xml:space="preserve">• Mục tiêu: Xây dựng client - server theo giao thức dòng ký tự kết thúc bằng xuống dòng trên kết nối TCP (cổng 5000), mã hóa UTF-8, sử dụng try-with-resources.</w:t>
-      </w:r>
-    </w:p>
-    <w:p>
-      <w:pPr>
-        <w:spacing w:before="60" w:after="60" w:line="280" w:lineRule="auto"/>
+        <w:spacing w:before="40" w:after="40" w:line="280" w:lineRule="auto"/>
+        <w:rPr>
+          <w:sz w:val="24"/>
+          <w:szCs w:val="24"/>
+          <w:lang w:val="vi-VN"/>
+        </w:rPr>
+      </w:pPr>
+      <w:r>
+        <w:rPr>
+          <w:sz w:val="24"/>
+          <w:szCs w:val="24"/>
+          <w:lang w:val="vi-VN"/>
+        </w:rPr>
+        <w:t xml:space="preserve">• Mục tiêu: Xây dựng client - server theo giao thức dòng ký tự UTF-8 kết thúc bằng xuống dòng trên kết nối TCP cổng 5000, sử dụng try-with-resources.</w:t>
+      </w:r>
+    </w:p>
+    <w:p>
+      <w:pPr>
+        <w:spacing w:before="40" w:after="40" w:line="280" w:lineRule="auto"/>
         <w:rPr>
           <w:sz w:val="24"/>
           <w:szCs w:val="24"/>
@@ -1481,7 +1481,7 @@
     </w:p>
     <w:p>
       <w:pPr>
-        <w:spacing w:before="60" w:after="60" w:line="280" w:lineRule="auto"/>
+        <w:spacing w:before="40" w:after="40" w:line="280" w:lineRule="auto"/>
         <w:rPr>
           <w:b/>
           <w:sz w:val="24"/>
@@ -1501,7 +1501,7 @@
     </w:p>
     <w:p>
       <w:pPr>
-        <w:spacing w:before="120" w:after="160"/>
+        <w:spacing w:before="100" w:after="160"/>
         <w:jc w:val="center"/>
       </w:pPr>
       <w:r>
@@ -1561,7 +1561,7 @@
           <w:szCs w:val="32"/>
           <w:lang w:val="vi-VN"/>
         </w:rPr>
-        <w:t>B. CÁC BÀI TẬP ĐỀ XUẤT</w:t>
+        <w:t>B. CÁC BÀI TẬP ĐỀ XUẤT LAB 4</w:t>
       </w:r>
     </w:p>
     <w:p>
@@ -1588,25 +1588,25 @@
     </w:p>
     <w:p>
       <w:pPr>
-        <w:spacing w:before="60" w:after="60" w:line="280" w:lineRule="auto"/>
-        <w:rPr>
-          <w:sz w:val="24"/>
-          <w:szCs w:val="24"/>
-          <w:lang w:val="vi-VN"/>
-        </w:rPr>
-      </w:pPr>
-      <w:r>
-        <w:rPr>
-          <w:sz w:val="24"/>
-          <w:szCs w:val="24"/>
-          <w:lang w:val="vi-VN"/>
-        </w:rPr>
-        <w:t xml:space="preserve">• Mục tiêu: Nhận hostname và URI qua tham số dòng lệnh (args); phân giải toàn bộ IP, phân loại IPv4/IPv6, loopback, site local; phân tích các thành phần URI (scheme, host, port, path, query, fragment) bằng java.net.URI.</w:t>
-      </w:r>
-    </w:p>
-    <w:p>
-      <w:pPr>
-        <w:spacing w:before="60" w:after="60" w:line="280" w:lineRule="auto"/>
+        <w:spacing w:before="40" w:after="40" w:line="280" w:lineRule="auto"/>
+        <w:rPr>
+          <w:sz w:val="24"/>
+          <w:szCs w:val="24"/>
+          <w:lang w:val="vi-VN"/>
+        </w:rPr>
+      </w:pPr>
+      <w:r>
+        <w:rPr>
+          <w:sz w:val="24"/>
+          <w:szCs w:val="24"/>
+          <w:lang w:val="vi-VN"/>
+        </w:rPr>
+        <w:t xml:space="preserve">• Mục tiêu: Nhận hostname và URI qua tham số args; phân giải toàn bộ IP, phân loại IPv4/IPv6, loopback, site local; phân tích chi tiết các thành phần URI (scheme, host, port, path, query, fragment) bằng java.net.URI.</w:t>
+      </w:r>
+    </w:p>
+    <w:p>
+      <w:pPr>
+        <w:spacing w:before="40" w:after="40" w:line="280" w:lineRule="auto"/>
         <w:rPr>
           <w:sz w:val="24"/>
           <w:szCs w:val="24"/>
@@ -1624,7 +1624,7 @@
     </w:p>
     <w:p>
       <w:pPr>
-        <w:spacing w:before="60" w:after="60" w:line="280" w:lineRule="auto"/>
+        <w:spacing w:before="40" w:after="40" w:line="280" w:lineRule="auto"/>
         <w:rPr>
           <w:b/>
           <w:sz w:val="24"/>
@@ -1644,7 +1644,7 @@
     </w:p>
     <w:p>
       <w:pPr>
-        <w:spacing w:before="120" w:after="160"/>
+        <w:spacing w:before="100" w:after="160"/>
         <w:jc w:val="center"/>
       </w:pPr>
       <w:r>
@@ -1709,7 +1709,7 @@
     </w:p>
     <w:p>
       <w:pPr>
-        <w:spacing w:before="60" w:after="60" w:line="280" w:lineRule="auto"/>
+        <w:spacing w:before="40" w:after="40" w:line="280" w:lineRule="auto"/>
         <w:rPr>
           <w:sz w:val="24"/>
           <w:szCs w:val="24"/>
@@ -1727,25 +1727,25 @@
     </w:p>
     <w:p>
       <w:pPr>
-        <w:spacing w:before="60" w:after="60" w:line="280" w:lineRule="auto"/>
-        <w:rPr>
-          <w:sz w:val="24"/>
-          <w:szCs w:val="24"/>
-          <w:lang w:val="vi-VN"/>
-        </w:rPr>
-      </w:pPr>
-      <w:r>
-        <w:rPr>
-          <w:sz w:val="24"/>
-          <w:szCs w:val="24"/>
-          <w:lang w:val="vi-VN"/>
-        </w:rPr>
-        <w:t xml:space="preserve">• Kiểm thử nghiêm ngặt các ca biên bắt buộc: 0 (không), 9 (chín), chuỗi rỗng "", 10, ký tự 'a', dữ liệu có khoảng trắng " 5 " đều trả về ERR INVALID_DIGIT; lệnh QUIT phản hồi OK BYE và đóng kết nối.</w:t>
-      </w:r>
-    </w:p>
-    <w:p>
-      <w:pPr>
-        <w:spacing w:before="60" w:after="60" w:line="280" w:lineRule="auto"/>
+        <w:spacing w:before="40" w:after="40" w:line="280" w:lineRule="auto"/>
+        <w:rPr>
+          <w:sz w:val="24"/>
+          <w:szCs w:val="24"/>
+          <w:lang w:val="vi-VN"/>
+        </w:rPr>
+      </w:pPr>
+      <w:r>
+        <w:rPr>
+          <w:sz w:val="24"/>
+          <w:szCs w:val="24"/>
+          <w:lang w:val="vi-VN"/>
+        </w:rPr>
+        <w:t xml:space="preserve">• Kiểm thử nghiêm ngặt các ca biên bắt buộc: 0 (không), 9 (chín), chuỗi rỗng "", 10, ký tự 'a', dữ liệu có khoảng trắng " 5 " đều trả về ERR INVALID_DIGIT; lệnh QUIT phản hồi OK BYE và đóng kết nối an toàn.</w:t>
+      </w:r>
+    </w:p>
+    <w:p>
+      <w:pPr>
+        <w:spacing w:before="40" w:after="40" w:line="280" w:lineRule="auto"/>
         <w:rPr>
           <w:b/>
           <w:sz w:val="24"/>
@@ -1765,7 +1765,7 @@
     </w:p>
     <w:p>
       <w:pPr>
-        <w:spacing w:before="120" w:after="160"/>
+        <w:spacing w:before="100" w:after="160"/>
         <w:jc w:val="center"/>
       </w:pPr>
       <w:r>
@@ -1830,25 +1830,25 @@
     </w:p>
     <w:p>
       <w:pPr>
-        <w:spacing w:before="60" w:after="60" w:line="280" w:lineRule="auto"/>
-        <w:rPr>
-          <w:sz w:val="24"/>
-          <w:szCs w:val="24"/>
-          <w:lang w:val="vi-VN"/>
-        </w:rPr>
-      </w:pPr>
-      <w:r>
-        <w:rPr>
-          <w:sz w:val="24"/>
-          <w:szCs w:val="24"/>
-          <w:lang w:val="vi-VN"/>
-        </w:rPr>
-        <w:t xml:space="preserve">• Mục tiêu: Xây dựng dịch vụ cung cấp ngày giờ trên cả hai giao thức TCP (cổng 5003) và UDP (cổng 5004). Hỗ trợ các lệnh: DATE, TIME, DATETIME sử dụng DateTimeFormatter định dạng dd/MM/yyyy và HH:mm:ss.</w:t>
-      </w:r>
-    </w:p>
-    <w:p>
-      <w:pPr>
-        <w:spacing w:before="60" w:after="60" w:line="280" w:lineRule="auto"/>
+        <w:spacing w:before="40" w:after="40" w:line="280" w:lineRule="auto"/>
+        <w:rPr>
+          <w:sz w:val="24"/>
+          <w:szCs w:val="24"/>
+          <w:lang w:val="vi-VN"/>
+        </w:rPr>
+      </w:pPr>
+      <w:r>
+        <w:rPr>
+          <w:sz w:val="24"/>
+          <w:szCs w:val="24"/>
+          <w:lang w:val="vi-VN"/>
+        </w:rPr>
+        <w:t xml:space="preserve">• Mục tiêu: Cung cấp dịch vụ ngày giờ trên cả hai giao thức TCP (cổng 5003) và UDP (cổng 5004). Hỗ trợ các lệnh: DATE, TIME, DATETIME sử dụng DateTimeFormatter định dạng dd/MM/yyyy và HH:mm:ss.</w:t>
+      </w:r>
+    </w:p>
+    <w:p>
+      <w:pPr>
+        <w:spacing w:before="40" w:after="40" w:line="280" w:lineRule="auto"/>
         <w:rPr>
           <w:b/>
           <w:sz w:val="24"/>
@@ -1868,43 +1868,43 @@
     </w:p>
     <w:p>
       <w:pPr>
-        <w:spacing w:before="60" w:after="60" w:line="280" w:lineRule="auto"/>
-        <w:rPr>
-          <w:sz w:val="24"/>
-          <w:szCs w:val="24"/>
-          <w:lang w:val="vi-VN"/>
-        </w:rPr>
-      </w:pPr>
-      <w:r>
-        <w:rPr>
-          <w:sz w:val="24"/>
-          <w:szCs w:val="24"/>
-          <w:lang w:val="vi-VN"/>
-        </w:rPr>
-        <w:t xml:space="preserve">  + Đối với TCP: Do TCP là giao thức hướng kết nối (connection-oriented) có phiên bắt tay và duy trì trạng thái kết nối. Khi Server dừng hoặc tắt tiến trình, TCP stack của Server gửi gói RST/FIN để đóng socket. TCP Client nhận diện trạng thái mất kết nối lập tức: lệnh readLine() trả về null hoặc ném ngoại lệ SocketException: Connection reset, Client xử lý ngắt kết nối an toàn ngay.</w:t>
-      </w:r>
-    </w:p>
-    <w:p>
-      <w:pPr>
-        <w:spacing w:before="60" w:after="60" w:line="280" w:lineRule="auto"/>
-        <w:rPr>
-          <w:sz w:val="24"/>
-          <w:szCs w:val="24"/>
-          <w:lang w:val="vi-VN"/>
-        </w:rPr>
-      </w:pPr>
-      <w:r>
-        <w:rPr>
-          <w:sz w:val="24"/>
-          <w:szCs w:val="24"/>
-          <w:lang w:val="vi-VN"/>
-        </w:rPr>
-        <w:t xml:space="preserve">  + Đối với UDP: Do UDP là giao thức phi kết nối (connectionless), không duy trì phiên làm việc. Khi Server dừng, Client không có kênh báo hiệu để biết Server đã chết. Khi Client gửi datagram đi, gói tin sẽ bị mất (drop) hoặc bị mạng loại bỏ. Nếu không có cơ chế timeout, Client sẽ bị treo vô hạn ở hàm socket.receive(). Bằng cách thiết lập socket.setSoTimeout(3000), Client sẽ ném ngoại lệ SocketTimeoutException sau 3 giây chờ, thông báo cho người dùng biết server không phản hồi và thoát hoặc thử lại.</w:t>
-      </w:r>
-    </w:p>
-    <w:p>
-      <w:pPr>
-        <w:spacing w:before="60" w:after="60" w:line="280" w:lineRule="auto"/>
+        <w:spacing w:before="40" w:after="40" w:line="280" w:lineRule="auto"/>
+        <w:rPr>
+          <w:sz w:val="24"/>
+          <w:szCs w:val="24"/>
+          <w:lang w:val="vi-VN"/>
+        </w:rPr>
+      </w:pPr>
+      <w:r>
+        <w:rPr>
+          <w:sz w:val="24"/>
+          <w:szCs w:val="24"/>
+          <w:lang w:val="vi-VN"/>
+        </w:rPr>
+        <w:t xml:space="preserve">  + Đối với TCP: Do là giao thức hướng kết nối (connection-oriented) có phiên bắt tay và duy trì trạng thái kết nối. Khi Server dừng hoặc tắt tiến trình, TCP stack của Server gửi gói RST/FIN để đóng socket. TCP Client nhận diện trạng thái mất kết nối lập tức: lệnh readLine() trả về null hoặc ném ngoại lệ SocketException: Connection reset, Client xử lý ngắt kết nối an toàn ngay.</w:t>
+      </w:r>
+    </w:p>
+    <w:p>
+      <w:pPr>
+        <w:spacing w:before="40" w:after="40" w:line="280" w:lineRule="auto"/>
+        <w:rPr>
+          <w:sz w:val="24"/>
+          <w:szCs w:val="24"/>
+          <w:lang w:val="vi-VN"/>
+        </w:rPr>
+      </w:pPr>
+      <w:r>
+        <w:rPr>
+          <w:sz w:val="24"/>
+          <w:szCs w:val="24"/>
+          <w:lang w:val="vi-VN"/>
+        </w:rPr>
+        <w:t xml:space="preserve">  + Đối với UDP: Do là giao thức phi kết nối (connectionless), không duy trì phiên làm việc. Khi Server dừng, Client không có kênh báo hiệu để biết Server đã chết. Khi Client gửi datagram đi, gói tin bị drop hoặc bị mạng loại bỏ. Nếu không có cơ chế timeout, Client sẽ bị treo vô hạn ở hàm socket.receive(). Bằng cách thiết lập socket.setSoTimeout(3000), Client sẽ ném ngoại lệ SocketTimeoutException sau 3 giây chờ, thông báo cho người dùng biết server không phản hồi và thoát hoặc thử lại.</w:t>
+      </w:r>
+    </w:p>
+    <w:p>
+      <w:pPr>
+        <w:spacing w:before="40" w:after="40" w:line="280" w:lineRule="auto"/>
         <w:rPr>
           <w:b/>
           <w:sz w:val="24"/>
@@ -1924,7 +1924,7 @@
     </w:p>
     <w:p>
       <w:pPr>
-        <w:spacing w:before="120" w:after="160"/>
+        <w:spacing w:before="100" w:after="160"/>
         <w:jc w:val="center"/>
       </w:pPr>
       <w:r>
@@ -1945,6 +1945,1015 @@
                   </pic:nvPicPr>
                   <pic:blipFill>
                     <a:blip r:embed="rId25"/>
+                    <a:stretch>
+                      <a:fillRect/>
+                    </a:stretch>
+                  </pic:blipFill>
+                  <pic:spPr>
+                    <a:xfrm>
+                      <a:off x="0" y="0"/>
+                      <a:ext cx="6400800" cy="3599815"/>
+                    </a:xfrm>
+                    <a:prstGeom prst="rect">
+                      <a:avLst/>
+                    </a:prstGeom>
+                  </pic:spPr>
+                </pic:pic>
+              </a:graphicData>
+            </a:graphic>
+          </wp:inline>
+        </w:drawing>
+      </w:r>
+    </w:p>
+    <w:p>
+      <w:pPr>
+        <w:spacing w:before="160" w:after="80"/>
+        <w:rPr>
+          <w:b/>
+          <w:color w:val="1F497D"/>
+          <w:sz w:val="26"/>
+          <w:szCs w:val="26"/>
+          <w:lang w:val="vi-VN"/>
+        </w:rPr>
+      </w:pPr>
+      <w:r>
+        <w:rPr>
+          <w:b/>
+          <w:color w:val="1F497D"/>
+          <w:sz w:val="26"/>
+          <w:szCs w:val="26"/>
+          <w:lang w:val="vi-VN"/>
+        </w:rPr>
+        <w:t>4. Bài tập 4: Máy tính từ xa (RemoteCalculatorServer.java &amp; RemoteCalculatorClient.java)</w:t>
+      </w:r>
+    </w:p>
+    <w:p>
+      <w:pPr>
+        <w:spacing w:before="40" w:after="40" w:line="280" w:lineRule="auto"/>
+        <w:rPr>
+          <w:sz w:val="24"/>
+          <w:szCs w:val="24"/>
+          <w:lang w:val="vi-VN"/>
+        </w:rPr>
+      </w:pPr>
+      <w:r>
+        <w:rPr>
+          <w:sz w:val="24"/>
+          <w:szCs w:val="24"/>
+          <w:lang w:val="vi-VN"/>
+        </w:rPr>
+        <w:t xml:space="preserve">• Mục tiêu: Thiết kế giao thức dòng theo mẫu: CALC &lt;toán_tử&gt; &lt;toán_hạng_1&gt; &lt;toán_hạng_2&gt;. Hỗ trợ 4 phép toán cơ bản (+, -, *, /) và phản hồi OK &lt;kết_quả&gt; hoặc các mã lỗi chuẩn.</w:t>
+      </w:r>
+    </w:p>
+    <w:p>
+      <w:pPr>
+        <w:spacing w:before="40" w:after="40" w:line="280" w:lineRule="auto"/>
+        <w:rPr>
+          <w:sz w:val="24"/>
+          <w:szCs w:val="24"/>
+          <w:lang w:val="vi-VN"/>
+        </w:rPr>
+      </w:pPr>
+      <w:r>
+        <w:rPr>
+          <w:sz w:val="24"/>
+          <w:szCs w:val="24"/>
+          <w:lang w:val="vi-VN"/>
+        </w:rPr>
+        <w:t xml:space="preserve">• Kiểm thử các tình huống:</w:t>
+      </w:r>
+    </w:p>
+    <w:p>
+      <w:pPr>
+        <w:spacing w:before="40" w:after="40" w:line="280" w:lineRule="auto"/>
+        <w:rPr>
+          <w:sz w:val="24"/>
+          <w:szCs w:val="24"/>
+          <w:lang w:val="vi-VN"/>
+        </w:rPr>
+      </w:pPr>
+      <w:r>
+        <w:rPr>
+          <w:sz w:val="24"/>
+          <w:szCs w:val="24"/>
+          <w:lang w:val="vi-VN"/>
+        </w:rPr>
+        <w:t xml:space="preserve">  + CALC + 100 200 -&gt; OK 300</w:t>
+      </w:r>
+    </w:p>
+    <w:p>
+      <w:pPr>
+        <w:spacing w:before="40" w:after="40" w:line="280" w:lineRule="auto"/>
+        <w:rPr>
+          <w:sz w:val="24"/>
+          <w:szCs w:val="24"/>
+          <w:lang w:val="vi-VN"/>
+        </w:rPr>
+      </w:pPr>
+      <w:r>
+        <w:rPr>
+          <w:sz w:val="24"/>
+          <w:szCs w:val="24"/>
+          <w:lang w:val="vi-VN"/>
+        </w:rPr>
+        <w:t xml:space="preserve">  + CALC / 10 0 -&gt; ERR DIVIDE_BY_ZERO</w:t>
+      </w:r>
+    </w:p>
+    <w:p>
+      <w:pPr>
+        <w:spacing w:before="40" w:after="40" w:line="280" w:lineRule="auto"/>
+        <w:rPr>
+          <w:sz w:val="24"/>
+          <w:szCs w:val="24"/>
+          <w:lang w:val="vi-VN"/>
+        </w:rPr>
+      </w:pPr>
+      <w:r>
+        <w:rPr>
+          <w:sz w:val="24"/>
+          <w:szCs w:val="24"/>
+          <w:lang w:val="vi-VN"/>
+        </w:rPr>
+        <w:t xml:space="preserve">  + CALC % 10 3 -&gt; ERR UNSUPPORTED_OPERATOR</w:t>
+      </w:r>
+    </w:p>
+    <w:p>
+      <w:pPr>
+        <w:spacing w:before="40" w:after="40" w:line="280" w:lineRule="auto"/>
+        <w:rPr>
+          <w:sz w:val="24"/>
+          <w:szCs w:val="24"/>
+          <w:lang w:val="vi-VN"/>
+        </w:rPr>
+      </w:pPr>
+      <w:r>
+        <w:rPr>
+          <w:sz w:val="24"/>
+          <w:szCs w:val="24"/>
+          <w:lang w:val="vi-VN"/>
+        </w:rPr>
+        <w:t xml:space="preserve">  + CALC + a 2 -&gt; ERR INVALID_NUMBER</w:t>
+      </w:r>
+    </w:p>
+    <w:p>
+      <w:pPr>
+        <w:spacing w:before="40" w:after="40" w:line="280" w:lineRule="auto"/>
+        <w:rPr>
+          <w:sz w:val="24"/>
+          <w:szCs w:val="24"/>
+          <w:lang w:val="vi-VN"/>
+        </w:rPr>
+      </w:pPr>
+      <w:r>
+        <w:rPr>
+          <w:sz w:val="24"/>
+          <w:szCs w:val="24"/>
+          <w:lang w:val="vi-VN"/>
+        </w:rPr>
+        <w:t xml:space="preserve">  + CALC + 10 (thiếu thành phần) -&gt; ERR INVALID_FORMAT</w:t>
+      </w:r>
+    </w:p>
+    <w:p>
+      <w:pPr>
+        <w:spacing w:before="40" w:after="40" w:line="280" w:lineRule="auto"/>
+        <w:rPr>
+          <w:sz w:val="24"/>
+          <w:szCs w:val="24"/>
+          <w:lang w:val="vi-VN"/>
+        </w:rPr>
+      </w:pPr>
+      <w:r>
+        <w:rPr>
+          <w:sz w:val="24"/>
+          <w:szCs w:val="24"/>
+          <w:lang w:val="vi-VN"/>
+        </w:rPr>
+        <w:t xml:space="preserve">  + QUIT -&gt; OK BYE</w:t>
+      </w:r>
+    </w:p>
+    <w:p>
+      <w:pPr>
+        <w:spacing w:before="40" w:after="40" w:line="280" w:lineRule="auto"/>
+        <w:rPr>
+          <w:b/>
+          <w:sz w:val="24"/>
+          <w:szCs w:val="24"/>
+          <w:lang w:val="vi-VN"/>
+        </w:rPr>
+      </w:pPr>
+      <w:r>
+        <w:rPr>
+          <w:b/>
+          <w:sz w:val="24"/>
+          <w:szCs w:val="24"/>
+          <w:lang w:val="vi-VN"/>
+        </w:rPr>
+        <w:t xml:space="preserve">• Hình ảnh toàn màn hình VS Code (mã nguồn + Terminal thực thi các phép toán và mã lỗi + Taskbar Desktop hiển thị thời gian hệ thống):</w:t>
+      </w:r>
+    </w:p>
+    <w:p>
+      <w:pPr>
+        <w:spacing w:before="100" w:after="160"/>
+        <w:jc w:val="center"/>
+      </w:pPr>
+      <w:r>
+        <w:drawing>
+          <wp:inline distT="0" distB="0" distL="0" distR="0">
+            <wp:extent cx="6400800" cy="3599815"/>
+            <wp:effectExtent l="0" t="0" r="0" b="0"/>
+            <wp:docPr id="106" name="Picture 106"/>
+            <wp:cNvGraphicFramePr>
+              <a:graphicFrameLocks xmlns:a="http://schemas.openxmlformats.org/drawingml/2006/main" noChangeAspect="1"/>
+            </wp:cNvGraphicFramePr>
+            <a:graphic xmlns:a="http://schemas.openxmlformats.org/drawingml/2006/main">
+              <a:graphicData uri="http://schemas.openxmlformats.org/drawingml/2006/picture">
+                <pic:pic xmlns:pic="http://schemas.openxmlformats.org/drawingml/2006/picture">
+                  <pic:nvPicPr>
+                    <pic:cNvPr id="106" name="Picture 106"/>
+                    <pic:cNvPicPr/>
+                  </pic:nvPicPr>
+                  <pic:blipFill>
+                    <a:blip r:embed="rId26"/>
+                    <a:stretch>
+                      <a:fillRect/>
+                    </a:stretch>
+                  </pic:blipFill>
+                  <pic:spPr>
+                    <a:xfrm>
+                      <a:off x="0" y="0"/>
+                      <a:ext cx="6400800" cy="3599815"/>
+                    </a:xfrm>
+                    <a:prstGeom prst="rect">
+                      <a:avLst/>
+                    </a:prstGeom>
+                  </pic:spPr>
+                </pic:pic>
+              </a:graphicData>
+            </a:graphic>
+          </wp:inline>
+        </w:drawing>
+      </w:r>
+    </w:p>
+    <w:p>
+      <w:pPr>
+        <w:spacing w:before="160" w:after="80"/>
+        <w:rPr>
+          <w:b/>
+          <w:color w:val="1F497D"/>
+          <w:sz w:val="26"/>
+          <w:szCs w:val="26"/>
+          <w:lang w:val="vi-VN"/>
+        </w:rPr>
+      </w:pPr>
+      <w:r>
+        <w:rPr>
+          <w:b/>
+          <w:color w:val="1F497D"/>
+          <w:sz w:val="26"/>
+          <w:szCs w:val="26"/>
+          <w:lang w:val="vi-VN"/>
+        </w:rPr>
+        <w:t>5. Bài tập 5: Chat TCP nhiều client (ChatServer.java &amp; ChatClient.java)</w:t>
+      </w:r>
+    </w:p>
+    <w:p>
+      <w:pPr>
+        <w:spacing w:before="40" w:after="40" w:line="280" w:lineRule="auto"/>
+        <w:rPr>
+          <w:sz w:val="24"/>
+          <w:szCs w:val="24"/>
+          <w:lang w:val="vi-VN"/>
+        </w:rPr>
+      </w:pPr>
+      <w:r>
+        <w:rPr>
+          <w:sz w:val="24"/>
+          <w:szCs w:val="24"/>
+          <w:lang w:val="vi-VN"/>
+        </w:rPr>
+        <w:t xml:space="preserve">• Mục tiêu: Xây dựng hệ thống chat nhóm thời gian thực qua giao thức TCP (cổng 7005). Server sử dụng Thread Pool kết hợp bảng băm đồng bộ ConcurrentHashMap để quản lý các client.</w:t>
+      </w:r>
+    </w:p>
+    <w:p>
+      <w:pPr>
+        <w:spacing w:before="40" w:after="40" w:line="280" w:lineRule="auto"/>
+        <w:rPr>
+          <w:sz w:val="24"/>
+          <w:szCs w:val="24"/>
+          <w:lang w:val="vi-VN"/>
+        </w:rPr>
+      </w:pPr>
+      <w:r>
+        <w:rPr>
+          <w:sz w:val="24"/>
+          <w:szCs w:val="24"/>
+          <w:lang w:val="vi-VN"/>
+        </w:rPr>
+        <w:t xml:space="preserve">• Chức năng: Đăng ký nickname duy nhất (NICK &lt;tên&gt;), xem danh sách đang online (USERS), gửi tin nhắn broadcast tới mọi thành viên (MSG &lt;nội_dung&gt;), và thoát phòng chat (QUIT). Khi client ngắt đột ngột, server tự động loại client khỏi danh sách và broadcast thông báo cho các thành viên còn lại.</w:t>
+      </w:r>
+    </w:p>
+    <w:p>
+      <w:pPr>
+        <w:spacing w:before="40" w:after="40" w:line="280" w:lineRule="auto"/>
+        <w:rPr>
+          <w:b/>
+          <w:sz w:val="24"/>
+          <w:szCs w:val="24"/>
+          <w:lang w:val="vi-VN"/>
+        </w:rPr>
+      </w:pPr>
+      <w:r>
+        <w:rPr>
+          <w:b/>
+          <w:sz w:val="24"/>
+          <w:szCs w:val="24"/>
+          <w:lang w:val="vi-VN"/>
+        </w:rPr>
+        <w:t xml:space="preserve">• Hình ảnh toàn màn hình VS Code (mã nguồn + Terminal thực thi đăng ký nick, xem users, chat broadcast + Taskbar Desktop hiển thị thời gian hệ thống):</w:t>
+      </w:r>
+    </w:p>
+    <w:p>
+      <w:pPr>
+        <w:spacing w:before="100" w:after="160"/>
+        <w:jc w:val="center"/>
+      </w:pPr>
+      <w:r>
+        <w:drawing>
+          <wp:inline distT="0" distB="0" distL="0" distR="0">
+            <wp:extent cx="6400800" cy="3599815"/>
+            <wp:effectExtent l="0" t="0" r="0" b="0"/>
+            <wp:docPr id="107" name="Picture 107"/>
+            <wp:cNvGraphicFramePr>
+              <a:graphicFrameLocks xmlns:a="http://schemas.openxmlformats.org/drawingml/2006/main" noChangeAspect="1"/>
+            </wp:cNvGraphicFramePr>
+            <a:graphic xmlns:a="http://schemas.openxmlformats.org/drawingml/2006/main">
+              <a:graphicData uri="http://schemas.openxmlformats.org/drawingml/2006/picture">
+                <pic:pic xmlns:pic="http://schemas.openxmlformats.org/drawingml/2006/picture">
+                  <pic:nvPicPr>
+                    <pic:cNvPr id="107" name="Picture 107"/>
+                    <pic:cNvPicPr/>
+                  </pic:nvPicPr>
+                  <pic:blipFill>
+                    <a:blip r:embed="rId27"/>
+                    <a:stretch>
+                      <a:fillRect/>
+                    </a:stretch>
+                  </pic:blipFill>
+                  <pic:spPr>
+                    <a:xfrm>
+                      <a:off x="0" y="0"/>
+                      <a:ext cx="6400800" cy="3599815"/>
+                    </a:xfrm>
+                    <a:prstGeom prst="rect">
+                      <a:avLst/>
+                    </a:prstGeom>
+                  </pic:spPr>
+                </pic:pic>
+              </a:graphicData>
+            </a:graphic>
+          </wp:inline>
+        </w:drawing>
+      </w:r>
+    </w:p>
+    <w:p>
+      <w:pPr>
+        <w:spacing w:before="160" w:after="80"/>
+        <w:rPr>
+          <w:b/>
+          <w:color w:val="1F497D"/>
+          <w:sz w:val="26"/>
+          <w:szCs w:val="26"/>
+          <w:lang w:val="vi-VN"/>
+        </w:rPr>
+      </w:pPr>
+      <w:r>
+        <w:rPr>
+          <w:b/>
+          <w:color w:val="1F497D"/>
+          <w:sz w:val="26"/>
+          <w:szCs w:val="26"/>
+          <w:lang w:val="vi-VN"/>
+        </w:rPr>
+        <w:t>6. Bài tập 6: Thực nghiệm so sánh hiệu năng TCP và UDP (TcpUdpBenchmark.java)</w:t>
+      </w:r>
+    </w:p>
+    <w:p>
+      <w:pPr>
+        <w:spacing w:before="40" w:after="40" w:line="280" w:lineRule="auto"/>
+        <w:rPr>
+          <w:sz w:val="24"/>
+          <w:szCs w:val="24"/>
+          <w:lang w:val="vi-VN"/>
+        </w:rPr>
+      </w:pPr>
+      <w:r>
+        <w:rPr>
+          <w:sz w:val="24"/>
+          <w:szCs w:val="24"/>
+          <w:lang w:val="vi-VN"/>
+        </w:rPr>
+        <w:t xml:space="preserve">• Mục tiêu: Gửi liên tục 1000 thông điệp kích thước cố định (64 bytes) bằng TCP và UDP trên localhost, đo tổng thời gian (ms) và số phản hồi nhận được, lặp lại 5 lần (5 runs) để có kết quả khách quan.</w:t>
+      </w:r>
+    </w:p>
+    <w:p>
+      <w:pPr>
+        <w:spacing w:before="40" w:after="40" w:line="280" w:lineRule="auto"/>
+        <w:rPr>
+          <w:sz w:val="24"/>
+          <w:szCs w:val="24"/>
+          <w:lang w:val="vi-VN"/>
+        </w:rPr>
+      </w:pPr>
+      <w:r>
+        <w:rPr>
+          <w:sz w:val="24"/>
+          <w:szCs w:val="24"/>
+          <w:lang w:val="vi-VN"/>
+        </w:rPr>
+        <w:t xml:space="preserve">• Đánh giá kết quả thực nghiệm:</w:t>
+      </w:r>
+    </w:p>
+    <w:p>
+      <w:pPr>
+        <w:spacing w:before="40" w:after="40" w:line="280" w:lineRule="auto"/>
+        <w:rPr>
+          <w:sz w:val="24"/>
+          <w:szCs w:val="24"/>
+          <w:lang w:val="vi-VN"/>
+        </w:rPr>
+      </w:pPr>
+      <w:r>
+        <w:rPr>
+          <w:sz w:val="24"/>
+          <w:szCs w:val="24"/>
+          <w:lang w:val="vi-VN"/>
+        </w:rPr>
+        <w:t xml:space="preserve">  + Độ tin cậy: TCP đạt tỉ lệ phản hồi 100% (1000/1000 gói tin) nhờ cơ chế ACK và tự động truyền lại gói tin khi có sự cố. UDP trên loopback cũng đạt tỷ lệ cao nhưng không bảo đảm trong môi trường mạng thực tế.</w:t>
+      </w:r>
+    </w:p>
+    <w:p>
+      <w:pPr>
+        <w:spacing w:before="40" w:after="40" w:line="280" w:lineRule="auto"/>
+        <w:rPr>
+          <w:sz w:val="24"/>
+          <w:szCs w:val="24"/>
+          <w:lang w:val="vi-VN"/>
+        </w:rPr>
+      </w:pPr>
+      <w:r>
+        <w:rPr>
+          <w:sz w:val="24"/>
+          <w:szCs w:val="24"/>
+          <w:lang w:val="vi-VN"/>
+        </w:rPr>
+        <w:t xml:space="preserve">  + Thời gian đáp ứng: UDP thường có thời gian hoàn thành nhanh hơn do không tốn overhead kiểm soát luồng, đánh số thứ tự và bắt tay 3 bước như TCP.</w:t>
+      </w:r>
+    </w:p>
+    <w:p>
+      <w:pPr>
+        <w:spacing w:before="40" w:after="40" w:line="280" w:lineRule="auto"/>
+        <w:rPr>
+          <w:b/>
+          <w:sz w:val="24"/>
+          <w:szCs w:val="24"/>
+          <w:lang w:val="vi-VN"/>
+        </w:rPr>
+      </w:pPr>
+      <w:r>
+        <w:rPr>
+          <w:b/>
+          <w:sz w:val="24"/>
+          <w:szCs w:val="24"/>
+          <w:lang w:val="vi-VN"/>
+        </w:rPr>
+        <w:t xml:space="preserve">• Hình ảnh toàn màn hình VS Code (mã nguồn + Terminal hiển thị bảng đo đạc 5 lượt chạy + Taskbar Desktop hiển thị thời gian hệ thống):</w:t>
+      </w:r>
+    </w:p>
+    <w:p>
+      <w:pPr>
+        <w:spacing w:before="100" w:after="160"/>
+        <w:jc w:val="center"/>
+      </w:pPr>
+      <w:r>
+        <w:drawing>
+          <wp:inline distT="0" distB="0" distL="0" distR="0">
+            <wp:extent cx="6400800" cy="3599815"/>
+            <wp:effectExtent l="0" t="0" r="0" b="0"/>
+            <wp:docPr id="108" name="Picture 108"/>
+            <wp:cNvGraphicFramePr>
+              <a:graphicFrameLocks xmlns:a="http://schemas.openxmlformats.org/drawingml/2006/main" noChangeAspect="1"/>
+            </wp:cNvGraphicFramePr>
+            <a:graphic xmlns:a="http://schemas.openxmlformats.org/drawingml/2006/main">
+              <a:graphicData uri="http://schemas.openxmlformats.org/drawingml/2006/picture">
+                <pic:pic xmlns:pic="http://schemas.openxmlformats.org/drawingml/2006/picture">
+                  <pic:nvPicPr>
+                    <pic:cNvPr id="108" name="Picture 108"/>
+                    <pic:cNvPicPr/>
+                  </pic:nvPicPr>
+                  <pic:blipFill>
+                    <a:blip r:embed="rId28"/>
+                    <a:stretch>
+                      <a:fillRect/>
+                    </a:stretch>
+                  </pic:blipFill>
+                  <pic:spPr>
+                    <a:xfrm>
+                      <a:off x="0" y="0"/>
+                      <a:ext cx="6400800" cy="3599815"/>
+                    </a:xfrm>
+                    <a:prstGeom prst="rect">
+                      <a:avLst/>
+                    </a:prstGeom>
+                  </pic:spPr>
+                </pic:pic>
+              </a:graphicData>
+            </a:graphic>
+          </wp:inline>
+        </w:drawing>
+      </w:r>
+    </w:p>
+    <w:p>
+      <w:pPr>
+        <w:spacing w:before="160" w:after="80"/>
+        <w:rPr>
+          <w:b/>
+          <w:color w:val="1F497D"/>
+          <w:sz w:val="26"/>
+          <w:szCs w:val="26"/>
+          <w:lang w:val="vi-VN"/>
+        </w:rPr>
+      </w:pPr>
+      <w:r>
+        <w:rPr>
+          <w:b/>
+          <w:color w:val="1F497D"/>
+          <w:sz w:val="26"/>
+          <w:szCs w:val="26"/>
+          <w:lang w:val="vi-VN"/>
+        </w:rPr>
+        <w:t>7. Bài tập 7: Server lưu nhật ký tin nhắn (MessageLogServer.java &amp; MessageLogClient.java)</w:t>
+      </w:r>
+    </w:p>
+    <w:p>
+      <w:pPr>
+        <w:spacing w:before="40" w:after="40" w:line="280" w:lineRule="auto"/>
+        <w:rPr>
+          <w:sz w:val="24"/>
+          <w:szCs w:val="24"/>
+          <w:lang w:val="vi-VN"/>
+        </w:rPr>
+      </w:pPr>
+      <w:r>
+        <w:rPr>
+          <w:sz w:val="24"/>
+          <w:szCs w:val="24"/>
+          <w:lang w:val="vi-VN"/>
+        </w:rPr>
+        <w:t xml:space="preserve">• Mục tiêu: Client bắt buộc gửi HELLO clientId trước khi gửi nội dung. Server kiểm tra định danh bằng biểu thức chính quy (^[a-zA-Z0-9_-]+$), từ chối nếu clientId không hợp lệ (ERR INVALID_CLIENT_ID).</w:t>
+      </w:r>
+    </w:p>
+    <w:p>
+      <w:pPr>
+        <w:spacing w:before="40" w:after="40" w:line="280" w:lineRule="auto"/>
+        <w:rPr>
+          <w:sz w:val="24"/>
+          <w:szCs w:val="24"/>
+          <w:lang w:val="vi-VN"/>
+        </w:rPr>
+      </w:pPr>
+      <w:r>
+        <w:rPr>
+          <w:sz w:val="24"/>
+          <w:szCs w:val="24"/>
+          <w:lang w:val="vi-VN"/>
+        </w:rPr>
+        <w:t xml:space="preserve">• Ghi nhật ký: Mỗi tin nhắn được ghi nối tiếp vào file data/logs/&lt;clientId&gt;.txt với khuôn dạng: [yyyy-MM-dd HH:mm:ss] [RemoteAddress] nội_dung. Kết thúc phiên an toàn bằng lệnh QUIT.</w:t>
+      </w:r>
+    </w:p>
+    <w:p>
+      <w:pPr>
+        <w:spacing w:before="40" w:after="40" w:line="280" w:lineRule="auto"/>
+        <w:rPr>
+          <w:b/>
+          <w:sz w:val="24"/>
+          <w:szCs w:val="24"/>
+          <w:lang w:val="vi-VN"/>
+        </w:rPr>
+      </w:pPr>
+      <w:r>
+        <w:rPr>
+          <w:b/>
+          <w:sz w:val="24"/>
+          <w:szCs w:val="24"/>
+          <w:lang w:val="vi-VN"/>
+        </w:rPr>
+        <w:t xml:space="preserve">• Hình ảnh toàn màn hình VS Code (mã nguồn + Terminal kết quả ghi log và xem nội dung file log + Taskbar Desktop hiển thị thời gian hệ thống):</w:t>
+      </w:r>
+    </w:p>
+    <w:p>
+      <w:pPr>
+        <w:spacing w:before="100" w:after="160"/>
+        <w:jc w:val="center"/>
+      </w:pPr>
+      <w:r>
+        <w:drawing>
+          <wp:inline distT="0" distB="0" distL="0" distR="0">
+            <wp:extent cx="6400800" cy="3599815"/>
+            <wp:effectExtent l="0" t="0" r="0" b="0"/>
+            <wp:docPr id="109" name="Picture 109"/>
+            <wp:cNvGraphicFramePr>
+              <a:graphicFrameLocks xmlns:a="http://schemas.openxmlformats.org/drawingml/2006/main" noChangeAspect="1"/>
+            </wp:cNvGraphicFramePr>
+            <a:graphic xmlns:a="http://schemas.openxmlformats.org/drawingml/2006/main">
+              <a:graphicData uri="http://schemas.openxmlformats.org/drawingml/2006/picture">
+                <pic:pic xmlns:pic="http://schemas.openxmlformats.org/drawingml/2006/picture">
+                  <pic:nvPicPr>
+                    <pic:cNvPr id="109" name="Picture 109"/>
+                    <pic:cNvPicPr/>
+                  </pic:nvPicPr>
+                  <pic:blipFill>
+                    <a:blip r:embed="rId29"/>
+                    <a:stretch>
+                      <a:fillRect/>
+                    </a:stretch>
+                  </pic:blipFill>
+                  <pic:spPr>
+                    <a:xfrm>
+                      <a:off x="0" y="0"/>
+                      <a:ext cx="6400800" cy="3599815"/>
+                    </a:xfrm>
+                    <a:prstGeom prst="rect">
+                      <a:avLst/>
+                    </a:prstGeom>
+                  </pic:spPr>
+                </pic:pic>
+              </a:graphicData>
+            </a:graphic>
+          </wp:inline>
+        </w:drawing>
+      </w:r>
+    </w:p>
+    <w:p>
+      <w:pPr>
+        <w:spacing w:before="160" w:after="80"/>
+        <w:rPr>
+          <w:b/>
+          <w:color w:val="1F497D"/>
+          <w:sz w:val="26"/>
+          <w:szCs w:val="26"/>
+          <w:lang w:val="vi-VN"/>
+        </w:rPr>
+      </w:pPr>
+      <w:r>
+        <w:rPr>
+          <w:b/>
+          <w:color w:val="1F497D"/>
+          <w:sz w:val="26"/>
+          <w:szCs w:val="26"/>
+          <w:lang w:val="vi-VN"/>
+        </w:rPr>
+        <w:t>8. Bài tập 8: Truyền file TCP an toàn (FileTransferServer.java &amp; FileTransferClient.java)</w:t>
+      </w:r>
+    </w:p>
+    <w:p>
+      <w:pPr>
+        <w:spacing w:before="40" w:after="40" w:line="280" w:lineRule="auto"/>
+        <w:rPr>
+          <w:sz w:val="24"/>
+          <w:szCs w:val="24"/>
+          <w:lang w:val="vi-VN"/>
+        </w:rPr>
+      </w:pPr>
+      <w:r>
+        <w:rPr>
+          <w:sz w:val="24"/>
+          <w:szCs w:val="24"/>
+          <w:lang w:val="vi-VN"/>
+        </w:rPr>
+        <w:t xml:space="preserve">• Mục tiêu: Client gửi metadata gồm tên file, kích thước kiểu long và mã băm SHA-256 trước phần dữ liệu. Server lưu vào thư mục upload cố định (uploads/), chủ động ngăn chặn tấn công Path Traversal (chứa ../).</w:t>
+      </w:r>
+    </w:p>
+    <w:p>
+      <w:pPr>
+        <w:spacing w:before="40" w:after="40" w:line="280" w:lineRule="auto"/>
+        <w:rPr>
+          <w:sz w:val="24"/>
+          <w:szCs w:val="24"/>
+          <w:lang w:val="vi-VN"/>
+        </w:rPr>
+      </w:pPr>
+      <w:r>
+        <w:rPr>
+          <w:sz w:val="24"/>
+          <w:szCs w:val="24"/>
+          <w:lang w:val="vi-VN"/>
+        </w:rPr>
+        <w:t xml:space="preserve">• Kiểm tra tính toàn vẹn: Server đọc đúng số byte khai báo, tính lại mã SHA-256 trên dữ liệu nhận được và so khớp với mã băm từ client (trả OK HASH_MATCH hoặc ERR HASH_MISMATCH).</w:t>
+      </w:r>
+    </w:p>
+    <w:p>
+      <w:pPr>
+        <w:spacing w:before="40" w:after="40" w:line="280" w:lineRule="auto"/>
+        <w:rPr>
+          <w:sz w:val="24"/>
+          <w:szCs w:val="24"/>
+          <w:lang w:val="vi-VN"/>
+        </w:rPr>
+      </w:pPr>
+      <w:r>
+        <w:rPr>
+          <w:sz w:val="24"/>
+          <w:szCs w:val="24"/>
+          <w:lang w:val="vi-VN"/>
+        </w:rPr>
+        <w:t xml:space="preserve">• Kiểm thử đầy đủ: File rỗng (0 bytes), file văn bản tiếng Việt UTF-8, file nhị phân ảnh mô phỏng, và ca thử nghiệm độc hại chứa đường dẫn ../../../etc/passwd bị ngăn chặn an toàn.</w:t>
+      </w:r>
+    </w:p>
+    <w:p>
+      <w:pPr>
+        <w:spacing w:before="40" w:after="40" w:line="280" w:lineRule="auto"/>
+        <w:rPr>
+          <w:b/>
+          <w:sz w:val="24"/>
+          <w:szCs w:val="24"/>
+          <w:lang w:val="vi-VN"/>
+        </w:rPr>
+      </w:pPr>
+      <w:r>
+        <w:rPr>
+          <w:b/>
+          <w:sz w:val="24"/>
+          <w:szCs w:val="24"/>
+          <w:lang w:val="vi-VN"/>
+        </w:rPr>
+        <w:t xml:space="preserve">• Hình ảnh toàn màn hình VS Code (mã nguồn + Terminal kiểm thử toàn diện các ca truyền file an toàn + Taskbar Desktop hiển thị thời gian hệ thống):</w:t>
+      </w:r>
+    </w:p>
+    <w:p>
+      <w:pPr>
+        <w:spacing w:before="100" w:after="160"/>
+        <w:jc w:val="center"/>
+      </w:pPr>
+      <w:r>
+        <w:drawing>
+          <wp:inline distT="0" distB="0" distL="0" distR="0">
+            <wp:extent cx="6400800" cy="3599815"/>
+            <wp:effectExtent l="0" t="0" r="0" b="0"/>
+            <wp:docPr id="110" name="Picture 110"/>
+            <wp:cNvGraphicFramePr>
+              <a:graphicFrameLocks xmlns:a="http://schemas.openxmlformats.org/drawingml/2006/main" noChangeAspect="1"/>
+            </wp:cNvGraphicFramePr>
+            <a:graphic xmlns:a="http://schemas.openxmlformats.org/drawingml/2006/main">
+              <a:graphicData uri="http://schemas.openxmlformats.org/drawingml/2006/picture">
+                <pic:pic xmlns:pic="http://schemas.openxmlformats.org/drawingml/2006/picture">
+                  <pic:nvPicPr>
+                    <pic:cNvPr id="110" name="Picture 110"/>
+                    <pic:cNvPicPr/>
+                  </pic:nvPicPr>
+                  <pic:blipFill>
+                    <a:blip r:embed="rId30"/>
+                    <a:stretch>
+                      <a:fillRect/>
+                    </a:stretch>
+                  </pic:blipFill>
+                  <pic:spPr>
+                    <a:xfrm>
+                      <a:off x="0" y="0"/>
+                      <a:ext cx="6400800" cy="3599815"/>
+                    </a:xfrm>
+                    <a:prstGeom prst="rect">
+                      <a:avLst/>
+                    </a:prstGeom>
+                  </pic:spPr>
+                </pic:pic>
+              </a:graphicData>
+            </a:graphic>
+          </wp:inline>
+        </w:drawing>
+      </w:r>
+    </w:p>
+    <w:p>
+      <w:pPr>
+        <w:spacing w:before="160" w:after="80"/>
+        <w:rPr>
+          <w:b/>
+          <w:color w:val="1F497D"/>
+          <w:sz w:val="26"/>
+          <w:szCs w:val="26"/>
+          <w:lang w:val="vi-VN"/>
+        </w:rPr>
+      </w:pPr>
+      <w:r>
+        <w:rPr>
+          <w:b/>
+          <w:color w:val="1F497D"/>
+          <w:sz w:val="26"/>
+          <w:szCs w:val="26"/>
+          <w:lang w:val="vi-VN"/>
+        </w:rPr>
+        <w:t>9. Bài tập 9: Multicast thông báo (MulticastSender.java &amp; MulticastReceiver.java)</w:t>
+      </w:r>
+    </w:p>
+    <w:p>
+      <w:pPr>
+        <w:spacing w:before="40" w:after="40" w:line="280" w:lineRule="auto"/>
+        <w:rPr>
+          <w:sz w:val="24"/>
+          <w:szCs w:val="24"/>
+          <w:lang w:val="vi-VN"/>
+        </w:rPr>
+      </w:pPr>
+      <w:r>
+        <w:rPr>
+          <w:sz w:val="24"/>
+          <w:szCs w:val="24"/>
+          <w:lang w:val="vi-VN"/>
+        </w:rPr>
+        <w:t xml:space="preserve">• Mục tiêu: Sender phát gói tin Datagram tới địa chỉ Multicast quản trị cục bộ 239.255.0.1 cổng 7010. Ít nhất 2 Receiver cùng tham gia group (joinGroup) và đồng thời nhận thông điệp phát thanh.</w:t>
+      </w:r>
+    </w:p>
+    <w:p>
+      <w:pPr>
+        <w:spacing w:before="40" w:after="40" w:line="280" w:lineRule="auto"/>
+        <w:rPr>
+          <w:sz w:val="24"/>
+          <w:szCs w:val="24"/>
+          <w:lang w:val="vi-VN"/>
+        </w:rPr>
+      </w:pPr>
+      <w:r>
+        <w:rPr>
+          <w:sz w:val="24"/>
+          <w:szCs w:val="24"/>
+          <w:lang w:val="vi-VN"/>
+        </w:rPr>
+        <w:t xml:space="preserve">• Yêu cầu kỹ thuật: Chỉ định rõ NetworkInterface khi tham gia và rời khỏi nhóm (leaveGroup) trước khi đóng socket. Ghi nhận cơ chế hoạt động đa hướng của MulticastSocket trên môi trường mạng nội bộ.</w:t>
+      </w:r>
+    </w:p>
+    <w:p>
+      <w:pPr>
+        <w:spacing w:before="40" w:after="40" w:line="280" w:lineRule="auto"/>
+        <w:rPr>
+          <w:b/>
+          <w:sz w:val="24"/>
+          <w:szCs w:val="24"/>
+          <w:lang w:val="vi-VN"/>
+        </w:rPr>
+      </w:pPr>
+      <w:r>
+        <w:rPr>
+          <w:b/>
+          <w:sz w:val="24"/>
+          <w:szCs w:val="24"/>
+          <w:lang w:val="vi-VN"/>
+        </w:rPr>
+        <w:t xml:space="preserve">• Hình ảnh toàn màn hình VS Code (mã nguồn + Terminal thực thi cả Sender và 2 Receiver nhận đồng thời 3 bản tin + Taskbar Desktop hiển thị thời gian hệ thống):</w:t>
+      </w:r>
+    </w:p>
+    <w:p>
+      <w:pPr>
+        <w:spacing w:before="100" w:after="160"/>
+        <w:jc w:val="center"/>
+      </w:pPr>
+      <w:r>
+        <w:drawing>
+          <wp:inline distT="0" distB="0" distL="0" distR="0">
+            <wp:extent cx="6400800" cy="3599815"/>
+            <wp:effectExtent l="0" t="0" r="0" b="0"/>
+            <wp:docPr id="111" name="Picture 111"/>
+            <wp:cNvGraphicFramePr>
+              <a:graphicFrameLocks xmlns:a="http://schemas.openxmlformats.org/drawingml/2006/main" noChangeAspect="1"/>
+            </wp:cNvGraphicFramePr>
+            <a:graphic xmlns:a="http://schemas.openxmlformats.org/drawingml/2006/main">
+              <a:graphicData uri="http://schemas.openxmlformats.org/drawingml/2006/picture">
+                <pic:pic xmlns:pic="http://schemas.openxmlformats.org/drawingml/2006/picture">
+                  <pic:nvPicPr>
+                    <pic:cNvPr id="111" name="Picture 111"/>
+                    <pic:cNvPicPr/>
+                  </pic:nvPicPr>
+                  <pic:blipFill>
+                    <a:blip r:embed="rId31"/>
+                    <a:stretch>
+                      <a:fillRect/>
+                    </a:stretch>
+                  </pic:blipFill>
+                  <pic:spPr>
+                    <a:xfrm>
+                      <a:off x="0" y="0"/>
+                      <a:ext cx="6400800" cy="3599815"/>
+                    </a:xfrm>
+                    <a:prstGeom prst="rect">
+                      <a:avLst/>
+                    </a:prstGeom>
+                  </pic:spPr>
+                </pic:pic>
+              </a:graphicData>
+            </a:graphic>
+          </wp:inline>
+        </w:drawing>
+      </w:r>
+    </w:p>
+    <w:p>
+      <w:pPr>
+        <w:spacing w:before="160" w:after="80"/>
+        <w:rPr>
+          <w:b/>
+          <w:color w:val="1F497D"/>
+          <w:sz w:val="26"/>
+          <w:szCs w:val="26"/>
+          <w:lang w:val="vi-VN"/>
+        </w:rPr>
+      </w:pPr>
+      <w:r>
+        <w:rPr>
+          <w:b/>
+          <w:color w:val="1F497D"/>
+          <w:sz w:val="26"/>
+          <w:szCs w:val="26"/>
+          <w:lang w:val="vi-VN"/>
+        </w:rPr>
+        <w:t>10. Bài tập 10: UDP discovery kết hợp TCP service (ServiceDiscoveryServer &amp; ServiceDiscoveryClient)</w:t>
+      </w:r>
+    </w:p>
+    <w:p>
+      <w:pPr>
+        <w:spacing w:before="40" w:after="40" w:line="280" w:lineRule="auto"/>
+        <w:rPr>
+          <w:sz w:val="24"/>
+          <w:szCs w:val="24"/>
+          <w:lang w:val="vi-VN"/>
+        </w:rPr>
+      </w:pPr>
+      <w:r>
+        <w:rPr>
+          <w:sz w:val="24"/>
+          <w:szCs w:val="24"/>
+          <w:lang w:val="vi-VN"/>
+        </w:rPr>
+        <w:t xml:space="preserve">• Mục tiêu: Khám phá dịch vụ tự động trong mạng nội bộ. Client phát gói tin UDP DISCOVER_SERVICE tới cổng 7011; Server lắng nghe và phản hồi: SERVICE IUH_MainService 7012 v2026.</w:t>
+      </w:r>
+    </w:p>
+    <w:p>
+      <w:pPr>
+        <w:spacing w:before="40" w:after="40" w:line="280" w:lineRule="auto"/>
+        <w:rPr>
+          <w:sz w:val="24"/>
+          <w:szCs w:val="24"/>
+          <w:lang w:val="vi-VN"/>
+        </w:rPr>
+      </w:pPr>
+      <w:r>
+        <w:rPr>
+          <w:sz w:val="24"/>
+          <w:szCs w:val="24"/>
+          <w:lang w:val="vi-VN"/>
+        </w:rPr>
+        <w:t xml:space="preserve">• Tự động kết nối TCP: Client lọc bỏ các phản hồi trùng lặp, trích xuất địa chỉ IP và cổng TCP từ gói tin UDP phản hồi, sau đó tự động mở kết nối Socket TCP tới dịch vụ để trao đổi các lệnh (ECHO, TIME, QUIT).</w:t>
+      </w:r>
+    </w:p>
+    <w:p>
+      <w:pPr>
+        <w:spacing w:before="40" w:after="40" w:line="280" w:lineRule="auto"/>
+        <w:rPr>
+          <w:b/>
+          <w:sz w:val="24"/>
+          <w:szCs w:val="24"/>
+          <w:lang w:val="vi-VN"/>
+        </w:rPr>
+      </w:pPr>
+      <w:r>
+        <w:rPr>
+          <w:b/>
+          <w:sz w:val="24"/>
+          <w:szCs w:val="24"/>
+          <w:lang w:val="vi-VN"/>
+        </w:rPr>
+        <w:t xml:space="preserve">• Hình ảnh toàn màn hình VS Code (mã nguồn + Terminal thực thi quá trình discovery và trao đổi dịch vụ TCP + Taskbar Desktop hiển thị thời gian hệ thống):</w:t>
+      </w:r>
+    </w:p>
+    <w:p>
+      <w:pPr>
+        <w:spacing w:before="100" w:after="160"/>
+        <w:jc w:val="center"/>
+      </w:pPr>
+      <w:r>
+        <w:drawing>
+          <wp:inline distT="0" distB="0" distL="0" distR="0">
+            <wp:extent cx="6400800" cy="3599815"/>
+            <wp:effectExtent l="0" t="0" r="0" b="0"/>
+            <wp:docPr id="112" name="Picture 112"/>
+            <wp:cNvGraphicFramePr>
+              <a:graphicFrameLocks xmlns:a="http://schemas.openxmlformats.org/drawingml/2006/main" noChangeAspect="1"/>
+            </wp:cNvGraphicFramePr>
+            <a:graphic xmlns:a="http://schemas.openxmlformats.org/drawingml/2006/main">
+              <a:graphicData uri="http://schemas.openxmlformats.org/drawingml/2006/picture">
+                <pic:pic xmlns:pic="http://schemas.openxmlformats.org/drawingml/2006/picture">
+                  <pic:nvPicPr>
+                    <pic:cNvPr id="112" name="Picture 112"/>
+                    <pic:cNvPicPr/>
+                  </pic:nvPicPr>
+                  <pic:blipFill>
+                    <a:blip r:embed="rId32"/>
                     <a:stretch>
                       <a:fillRect/>
                     </a:stretch>

</xml_diff>